<commit_message>
yesterday's file I forgot to commit
</commit_message>
<xml_diff>
--- a/TEVC-SecondRoundRevision/ReviewsCommented_with_responses.docx
+++ b/TEVC-SecondRoundRevision/ReviewsCommented_with_responses.docx
@@ -111,6 +111,14 @@
           <w:szCs w:val="21"/>
         </w:rPr>
         <w:br/>
+      </w:r>
+      <w:r>
+        <w:rPr>
+          <w:rFonts w:ascii="Lucida Grande" w:hAnsi="Lucida Grande" w:cs="Lucida Grande"/>
+          <w:color w:val="000000"/>
+          <w:sz w:val="21"/>
+          <w:szCs w:val="21"/>
+        </w:rPr>
         <w:br/>
       </w:r>
       <w:r>
@@ -152,6 +160,14 @@
           <w:szCs w:val="21"/>
         </w:rPr>
         <w:br/>
+      </w:r>
+      <w:r>
+        <w:rPr>
+          <w:rFonts w:ascii="Lucida Grande" w:hAnsi="Lucida Grande" w:cs="Lucida Grande"/>
+          <w:color w:val="000000"/>
+          <w:sz w:val="21"/>
+          <w:szCs w:val="21"/>
+        </w:rPr>
         <w:br/>
       </w:r>
       <w:r>
@@ -191,6 +207,14 @@
           <w:szCs w:val="21"/>
         </w:rPr>
         <w:br/>
+      </w:r>
+      <w:r>
+        <w:rPr>
+          <w:rFonts w:ascii="Lucida Grande" w:hAnsi="Lucida Grande" w:cs="Lucida Grande"/>
+          <w:color w:val="000000"/>
+          <w:sz w:val="21"/>
+          <w:szCs w:val="21"/>
+        </w:rPr>
         <w:br/>
       </w:r>
       <w:r>
@@ -211,6 +235,14 @@
           <w:szCs w:val="21"/>
         </w:rPr>
         <w:br/>
+      </w:r>
+      <w:r>
+        <w:rPr>
+          <w:rFonts w:ascii="Lucida Grande" w:hAnsi="Lucida Grande" w:cs="Lucida Grande"/>
+          <w:color w:val="000000"/>
+          <w:sz w:val="21"/>
+          <w:szCs w:val="21"/>
+        </w:rPr>
         <w:br/>
       </w:r>
       <w:r>
@@ -231,6 +263,14 @@
           <w:szCs w:val="21"/>
         </w:rPr>
         <w:br/>
+      </w:r>
+      <w:r>
+        <w:rPr>
+          <w:rFonts w:ascii="Lucida Grande" w:hAnsi="Lucida Grande" w:cs="Lucida Grande"/>
+          <w:color w:val="000000"/>
+          <w:sz w:val="21"/>
+          <w:szCs w:val="21"/>
+        </w:rPr>
         <w:br/>
       </w:r>
       <w:r>
@@ -421,6 +461,14 @@
           <w:szCs w:val="21"/>
         </w:rPr>
         <w:br/>
+      </w:r>
+      <w:r>
+        <w:rPr>
+          <w:rFonts w:ascii="Lucida Grande" w:hAnsi="Lucida Grande" w:cs="Lucida Grande"/>
+          <w:color w:val="000000"/>
+          <w:sz w:val="21"/>
+          <w:szCs w:val="21"/>
+        </w:rPr>
         <w:lastRenderedPageBreak/>
         <w:br/>
       </w:r>
@@ -657,6 +705,14 @@
           <w:szCs w:val="21"/>
         </w:rPr>
         <w:br/>
+      </w:r>
+      <w:r>
+        <w:rPr>
+          <w:rFonts w:ascii="Lucida Grande" w:hAnsi="Lucida Grande" w:cs="Lucida Grande"/>
+          <w:color w:val="000000"/>
+          <w:sz w:val="21"/>
+          <w:szCs w:val="21"/>
+        </w:rPr>
         <w:br/>
       </w:r>
       <w:r>
@@ -717,6 +773,14 @@
           <w:szCs w:val="21"/>
         </w:rPr>
         <w:br/>
+      </w:r>
+      <w:r>
+        <w:rPr>
+          <w:rFonts w:ascii="Lucida Grande" w:hAnsi="Lucida Grande" w:cs="Lucida Grande"/>
+          <w:color w:val="000000"/>
+          <w:sz w:val="21"/>
+          <w:szCs w:val="21"/>
+        </w:rPr>
         <w:br/>
       </w:r>
       <w:r>
@@ -857,7 +921,6 @@
           <w:sz w:val="21"/>
           <w:szCs w:val="21"/>
         </w:rPr>
-        <w:lastRenderedPageBreak/>
         <w:br/>
       </w:r>
       <w:r>
@@ -910,6 +973,14 @@
           <w:szCs w:val="21"/>
         </w:rPr>
         <w:br/>
+      </w:r>
+      <w:r>
+        <w:rPr>
+          <w:rFonts w:ascii="Lucida Grande" w:hAnsi="Lucida Grande" w:cs="Lucida Grande"/>
+          <w:color w:val="000000"/>
+          <w:sz w:val="21"/>
+          <w:szCs w:val="21"/>
+        </w:rPr>
         <w:br/>
       </w:r>
       <w:r>
@@ -970,7 +1041,23 @@
           <w:szCs w:val="21"/>
         </w:rPr>
         <w:t>.</w:t>
-        <w:br/>
+      </w:r>
+      <w:r>
+        <w:rPr>
+          <w:rFonts w:ascii="Lucida Grande" w:hAnsi="Lucida Grande" w:cs="Lucida Grande"/>
+          <w:color w:val="000000"/>
+          <w:sz w:val="21"/>
+          <w:szCs w:val="21"/>
+        </w:rPr>
+        <w:br/>
+      </w:r>
+      <w:r>
+        <w:rPr>
+          <w:rFonts w:ascii="Lucida Grande" w:hAnsi="Lucida Grande" w:cs="Lucida Grande"/>
+          <w:color w:val="000000"/>
+          <w:sz w:val="21"/>
+          <w:szCs w:val="21"/>
+        </w:rPr>
         <w:br/>
       </w:r>
       <w:r>
@@ -1022,44 +1109,7 @@
           <w:szCs w:val="21"/>
           <w:shd w:val="clear" w:color="auto" w:fill="FFFFFF"/>
         </w:rPr>
-        <w:t>No, we just think that the exponential decrease operator makes more sense if the mutation rate decreases with the Hamming distance rather than with the difference in fitness values: “</w:t>
-      </w:r>
-      <w:r>
-        <w:rPr>
-          <w:rFonts w:ascii="NimbusRomNo9L" w:hAnsi="NimbusRomNo9L"/>
-          <w:color w:val="0070C0"/>
-          <w:sz w:val="20"/>
-          <w:szCs w:val="20"/>
-        </w:rPr>
-        <w:t xml:space="preserve">the ideal amount of bits to be flipped clearly depends on the genotypic distance of the candidate solution to the optimum rather than on their difference in fitness values.” </w:t>
-      </w:r>
-      <w:r>
-        <w:rPr>
-          <w:rFonts w:ascii="Lucida Grande" w:hAnsi="Lucida Grande" w:cs="Lucida Grande"/>
-          <w:color w:val="000000"/>
-          <w:sz w:val="21"/>
-          <w:szCs w:val="21"/>
-        </w:rPr>
-        <w:br/>
-      </w:r>
-      <w:r>
-        <w:rPr>
-          <w:rFonts w:ascii="Lucida Grande" w:hAnsi="Lucida Grande" w:cs="Lucida Grande"/>
-          <w:color w:val="EE0000"/>
-          <w:sz w:val="21"/>
-          <w:szCs w:val="21"/>
-        </w:rPr>
-        <w:t>Dogan: check</w:t>
-      </w:r>
-      <w:r>
-        <w:rPr>
-          <w:rFonts w:ascii="Lucida Grande" w:hAnsi="Lucida Grande" w:cs="Lucida Grande"/>
-          <w:color w:val="00B050"/>
-          <w:sz w:val="21"/>
-          <w:szCs w:val="21"/>
-          <w:shd w:val="clear" w:color="auto" w:fill="FFFFFF"/>
-        </w:rPr>
-        <w:t xml:space="preserve"> Done. We agree with the reviewer and have moved the HD motivation before the Zarges discussion.</w:t>
+        <w:t>We have moved the motivation above.</w:t>
       </w:r>
       <w:r>
         <w:rPr>
@@ -1171,6 +1221,15 @@
           <w:shd w:val="clear" w:color="auto" w:fill="FFFFFF"/>
         </w:rPr>
         <w:t>Dogan?</w:t>
+      </w:r>
+      <w:r>
+        <w:rPr>
+          <w:rFonts w:ascii="Lucida Grande" w:hAnsi="Lucida Grande" w:cs="Lucida Grande"/>
+          <w:color w:val="EE0000"/>
+          <w:sz w:val="21"/>
+          <w:szCs w:val="21"/>
+          <w:shd w:val="clear" w:color="auto" w:fill="FFFFFF"/>
+        </w:rPr>
         <w:br/>
       </w:r>
       <w:r>
@@ -1378,6 +1437,14 @@
           <w:szCs w:val="21"/>
         </w:rPr>
         <w:br/>
+      </w:r>
+      <w:r>
+        <w:rPr>
+          <w:rFonts w:ascii="Lucida Grande" w:hAnsi="Lucida Grande" w:cs="Lucida Grande"/>
+          <w:color w:val="000000"/>
+          <w:sz w:val="21"/>
+          <w:szCs w:val="21"/>
+        </w:rPr>
         <w:br/>
       </w:r>
       <w:r>
@@ -1430,6 +1497,15 @@
           <w:shd w:val="clear" w:color="auto" w:fill="FFFFFF"/>
         </w:rPr>
         <w:t xml:space="preserve">Done. </w:t>
+      </w:r>
+      <w:r>
+        <w:rPr>
+          <w:rFonts w:ascii="Lucida Grande" w:hAnsi="Lucida Grande" w:cs="Lucida Grande"/>
+          <w:color w:val="0070C0"/>
+          <w:sz w:val="21"/>
+          <w:szCs w:val="21"/>
+          <w:shd w:val="clear" w:color="auto" w:fill="FFFFFF"/>
+        </w:rPr>
         <w:br/>
       </w:r>
       <w:r>
@@ -1460,6 +1536,15 @@
           <w:shd w:val="clear" w:color="auto" w:fill="FFFFFF"/>
         </w:rPr>
         <w:t>Dogan?</w:t>
+      </w:r>
+      <w:r>
+        <w:rPr>
+          <w:rFonts w:ascii="Lucida Grande" w:hAnsi="Lucida Grande" w:cs="Lucida Grande"/>
+          <w:color w:val="EE0000"/>
+          <w:sz w:val="21"/>
+          <w:szCs w:val="21"/>
+          <w:shd w:val="clear" w:color="auto" w:fill="FFFFFF"/>
+        </w:rPr>
         <w:br/>
       </w:r>
       <w:r>
@@ -1519,6 +1604,14 @@
           <w:szCs w:val="21"/>
         </w:rPr>
         <w:br/>
+      </w:r>
+      <w:r>
+        <w:rPr>
+          <w:rFonts w:ascii="Lucida Grande" w:hAnsi="Lucida Grande" w:cs="Lucida Grande"/>
+          <w:color w:val="000000"/>
+          <w:sz w:val="21"/>
+          <w:szCs w:val="21"/>
+        </w:rPr>
         <w:br/>
       </w:r>
       <w:r>
@@ -1713,6 +1806,14 @@
           <w:szCs w:val="21"/>
         </w:rPr>
         <w:br/>
+      </w:r>
+      <w:r>
+        <w:rPr>
+          <w:rFonts w:ascii="Lucida Grande" w:hAnsi="Lucida Grande" w:cs="Lucida Grande"/>
+          <w:color w:val="000000"/>
+          <w:sz w:val="21"/>
+          <w:szCs w:val="21"/>
+        </w:rPr>
         <w:br/>
       </w:r>
       <w:r>
@@ -1742,7 +1843,18 @@
           <w:szCs w:val="21"/>
           <w:shd w:val="clear" w:color="auto" w:fill="FFFFFF"/>
         </w:rPr>
-        <w:t xml:space="preserve">- Theorem 9: I was not precise in my comments to the previous revision, I meant that $\varepsilon$ in the expression for $c$ should be the same as $\epsilon$ in the expression for $d$. Now you use two different symbols for them. At the same time, I would also replace $\epsilon'$ for $\tau$ with $\varepsilon'$, so that $\epsilon$ and $\varepsilon$ were not mixed. </w:t>
+        <w:t xml:space="preserve">- Theorem 9: I was not precise in my comments to the previous revision, I meant that $\varepsilon$ in the expression for $c$ should be the same as $\epsilon$ in the expression for $d$. Now you use two different symbols for them. At the same time, I would also replace $\epsilon'$ for $\tau$ with $\varepsilon'$, so that $\epsilon$ and </w:t>
+      </w:r>
+      <w:r>
+        <w:rPr>
+          <w:rFonts w:ascii="Lucida Grande" w:hAnsi="Lucida Grande" w:cs="Lucida Grande"/>
+          <w:color w:val="000000"/>
+          <w:sz w:val="21"/>
+          <w:szCs w:val="21"/>
+          <w:shd w:val="clear" w:color="auto" w:fill="FFFFFF"/>
+        </w:rPr>
+        <w:lastRenderedPageBreak/>
+        <w:t xml:space="preserve">$\varepsilon$ were not mixed. </w:t>
       </w:r>
       <w:r>
         <w:rPr>
@@ -1783,7 +1895,6 @@
           <w:sz w:val="21"/>
           <w:szCs w:val="21"/>
         </w:rPr>
-        <w:lastRenderedPageBreak/>
         <w:br/>
       </w:r>
       <w:r>
@@ -1824,6 +1935,14 @@
           <w:szCs w:val="21"/>
         </w:rPr>
         <w:br/>
+      </w:r>
+      <w:r>
+        <w:rPr>
+          <w:rFonts w:ascii="Lucida Grande" w:hAnsi="Lucida Grande" w:cs="Lucida Grande"/>
+          <w:color w:val="000000"/>
+          <w:sz w:val="21"/>
+          <w:szCs w:val="21"/>
+        </w:rPr>
         <w:br/>
       </w:r>
       <w:r>
@@ -1922,6 +2041,14 @@
           <w:szCs w:val="21"/>
         </w:rPr>
         <w:br/>
+      </w:r>
+      <w:r>
+        <w:rPr>
+          <w:rFonts w:ascii="Lucida Grande" w:hAnsi="Lucida Grande" w:cs="Lucida Grande"/>
+          <w:color w:val="000000"/>
+          <w:sz w:val="21"/>
+          <w:szCs w:val="21"/>
+        </w:rPr>
         <w:br/>
       </w:r>
       <w:r>
@@ -1983,6 +2110,14 @@
           <w:szCs w:val="21"/>
         </w:rPr>
         <w:br/>
+      </w:r>
+      <w:r>
+        <w:rPr>
+          <w:rFonts w:ascii="Lucida Grande" w:hAnsi="Lucida Grande" w:cs="Lucida Grande"/>
+          <w:color w:val="000000"/>
+          <w:sz w:val="21"/>
+          <w:szCs w:val="21"/>
+        </w:rPr>
         <w:br/>
       </w:r>
       <w:r>
@@ -2042,6 +2177,14 @@
           <w:szCs w:val="21"/>
         </w:rPr>
         <w:br/>
+      </w:r>
+      <w:r>
+        <w:rPr>
+          <w:rFonts w:ascii="Lucida Grande" w:hAnsi="Lucida Grande" w:cs="Lucida Grande"/>
+          <w:color w:val="000000"/>
+          <w:sz w:val="21"/>
+          <w:szCs w:val="21"/>
+        </w:rPr>
         <w:br/>
       </w:r>
       <w:r>
@@ -2103,8 +2246,32 @@
           <w:szCs w:val="21"/>
         </w:rPr>
         <w:br/>
-        <w:br/>
-        <w:br/>
+      </w:r>
+      <w:r>
+        <w:rPr>
+          <w:rFonts w:ascii="Lucida Grande" w:hAnsi="Lucida Grande" w:cs="Lucida Grande"/>
+          <w:color w:val="000000"/>
+          <w:sz w:val="21"/>
+          <w:szCs w:val="21"/>
+        </w:rPr>
+        <w:br/>
+      </w:r>
+      <w:r>
+        <w:rPr>
+          <w:rFonts w:ascii="Lucida Grande" w:hAnsi="Lucida Grande" w:cs="Lucida Grande"/>
+          <w:color w:val="000000"/>
+          <w:sz w:val="21"/>
+          <w:szCs w:val="21"/>
+        </w:rPr>
+        <w:br/>
+      </w:r>
+      <w:r>
+        <w:rPr>
+          <w:rFonts w:ascii="Lucida Grande" w:hAnsi="Lucida Grande" w:cs="Lucida Grande"/>
+          <w:color w:val="000000"/>
+          <w:sz w:val="21"/>
+          <w:szCs w:val="21"/>
+        </w:rPr>
         <w:br/>
       </w:r>
       <w:r>
@@ -2125,6 +2292,14 @@
           <w:szCs w:val="21"/>
         </w:rPr>
         <w:br/>
+      </w:r>
+      <w:r>
+        <w:rPr>
+          <w:rFonts w:ascii="Lucida Grande" w:hAnsi="Lucida Grande" w:cs="Lucida Grande"/>
+          <w:color w:val="000000"/>
+          <w:sz w:val="21"/>
+          <w:szCs w:val="21"/>
+        </w:rPr>
         <w:br/>
       </w:r>
       <w:r>
@@ -2164,6 +2339,14 @@
           <w:szCs w:val="21"/>
         </w:rPr>
         <w:br/>
+      </w:r>
+      <w:r>
+        <w:rPr>
+          <w:rFonts w:ascii="Lucida Grande" w:hAnsi="Lucida Grande" w:cs="Lucida Grande"/>
+          <w:color w:val="000000"/>
+          <w:sz w:val="21"/>
+          <w:szCs w:val="21"/>
+        </w:rPr>
         <w:br/>
       </w:r>
       <w:r>
@@ -2358,6 +2541,14 @@
           <w:szCs w:val="21"/>
         </w:rPr>
         <w:br/>
+      </w:r>
+      <w:r>
+        <w:rPr>
+          <w:rFonts w:ascii="Lucida Grande" w:hAnsi="Lucida Grande" w:cs="Lucida Grande"/>
+          <w:color w:val="000000"/>
+          <w:sz w:val="21"/>
+          <w:szCs w:val="21"/>
+        </w:rPr>
         <w:br/>
       </w:r>
       <w:r>
@@ -2378,6 +2569,14 @@
           <w:szCs w:val="21"/>
         </w:rPr>
         <w:br/>
+      </w:r>
+      <w:r>
+        <w:rPr>
+          <w:rFonts w:ascii="Lucida Grande" w:hAnsi="Lucida Grande" w:cs="Lucida Grande"/>
+          <w:color w:val="000000"/>
+          <w:sz w:val="21"/>
+          <w:szCs w:val="21"/>
+        </w:rPr>
         <w:br/>
       </w:r>
       <w:r>
@@ -2407,18 +2606,35 @@
           <w:szCs w:val="21"/>
           <w:shd w:val="clear" w:color="auto" w:fill="FFFFFF"/>
         </w:rPr>
-        <w:t xml:space="preserve">This paper considers variants of the Inversely Proportional Hypermutation (IPH) operator in Artificial Immune Systems. IPH adapts online how disruptive it is with respect to the current distance in fitness or genotype space to the optimum or best-seen solution. The authors first prove tight bounds on a (1+1) IA when the optimum is known. When the mutation potential is scaled linearly with Hamming distance to the optimal, they derive quadratic (resp., cubic) bounds on OneMax (resp., LeadingOnes). For OneMax, they prove that using exponential scaling improves this by a sqrt(n)*log(n) factor. In the case of LeadingOnes, exponential scaling with fitness improves the cubic bound by at </w:t>
+        <w:t xml:space="preserve">This paper considers variants of the Inversely Proportional Hypermutation (IPH) operator in Artificial Immune Systems. IPH adapts online how disruptive it is with respect to the current distance in fitness or genotype space to the optimum or best-seen solution. </w:t>
+      </w:r>
+      <w:r>
+        <w:rPr>
+          <w:rFonts w:ascii="Lucida Grande" w:hAnsi="Lucida Grande" w:cs="Lucida Grande"/>
+          <w:color w:val="000000"/>
+          <w:sz w:val="21"/>
+          <w:szCs w:val="21"/>
+          <w:shd w:val="clear" w:color="auto" w:fill="FFFFFF"/>
+        </w:rPr>
         <w:lastRenderedPageBreak/>
-        <w:t>least polylog factor (and even an additional root n factor when Hamming distance is used). In the typical optimization setting when the optimum is not known in advance, the algorithms must rely on estimates of the true optimum in order to usefully set the hypermutation potential. The authors propose using the best-so-far solution as a surrogate for this purpose and introduce two variants Opt-IA-FirstBest and Opt-IA-LastBest that differ in their update of the current best solution with respect to fitness strictness. They give tight asymptotic bounds on OneMax and Leading ones by showing that, under the correct parameter settings, these variants behave identically to RLS. They also give upper bounds on the Cliff function and LeadingTrapJump with the aim of demonstrating different strategies of escaping local optima.</w:t>
-      </w:r>
-      <w:r>
-        <w:rPr>
-          <w:rFonts w:ascii="Lucida Grande" w:hAnsi="Lucida Grande" w:cs="Lucida Grande"/>
-          <w:color w:val="000000"/>
-          <w:sz w:val="21"/>
-          <w:szCs w:val="21"/>
-        </w:rPr>
-        <w:br/>
+        <w:t>The authors first prove tight bounds on a (1+1) IA when the optimum is known. When the mutation potential is scaled linearly with Hamming distance to the optimal, they derive quadratic (resp., cubic) bounds on OneMax (resp., LeadingOnes). For OneMax, they prove that using exponential scaling improves this by a sqrt(n)*log(n) factor. In the case of LeadingOnes, exponential scaling with fitness improves the cubic bound by at least polylog factor (and even an additional root n factor when Hamming distance is used). In the typical optimization setting when the optimum is not known in advance, the algorithms must rely on estimates of the true optimum in order to usefully set the hypermutation potential. The authors propose using the best-so-far solution as a surrogate for this purpose and introduce two variants Opt-IA-FirstBest and Opt-IA-LastBest that differ in their update of the current best solution with respect to fitness strictness. They give tight asymptotic bounds on OneMax and Leading ones by showing that, under the correct parameter settings, these variants behave identically to RLS. They also give upper bounds on the Cliff function and LeadingTrapJump with the aim of demonstrating different strategies of escaping local optima.</w:t>
+      </w:r>
+      <w:r>
+        <w:rPr>
+          <w:rFonts w:ascii="Lucida Grande" w:hAnsi="Lucida Grande" w:cs="Lucida Grande"/>
+          <w:color w:val="000000"/>
+          <w:sz w:val="21"/>
+          <w:szCs w:val="21"/>
+        </w:rPr>
+        <w:br/>
+      </w:r>
+      <w:r>
+        <w:rPr>
+          <w:rFonts w:ascii="Lucida Grande" w:hAnsi="Lucida Grande" w:cs="Lucida Grande"/>
+          <w:color w:val="000000"/>
+          <w:sz w:val="21"/>
+          <w:szCs w:val="21"/>
+        </w:rPr>
         <w:br/>
       </w:r>
       <w:r>
@@ -2459,6 +2675,14 @@
           <w:szCs w:val="21"/>
         </w:rPr>
         <w:br/>
+      </w:r>
+      <w:r>
+        <w:rPr>
+          <w:rFonts w:ascii="Lucida Grande" w:hAnsi="Lucida Grande" w:cs="Lucida Grande"/>
+          <w:color w:val="000000"/>
+          <w:sz w:val="21"/>
+          <w:szCs w:val="21"/>
+        </w:rPr>
         <w:br/>
       </w:r>
       <w:r>
@@ -2479,6 +2703,14 @@
           <w:szCs w:val="21"/>
         </w:rPr>
         <w:br/>
+      </w:r>
+      <w:r>
+        <w:rPr>
+          <w:rFonts w:ascii="Lucida Grande" w:hAnsi="Lucida Grande" w:cs="Lucida Grande"/>
+          <w:color w:val="000000"/>
+          <w:sz w:val="21"/>
+          <w:szCs w:val="21"/>
+        </w:rPr>
         <w:br/>
       </w:r>
       <w:r>
@@ -2539,6 +2771,14 @@
           <w:szCs w:val="21"/>
         </w:rPr>
         <w:br/>
+      </w:r>
+      <w:r>
+        <w:rPr>
+          <w:rFonts w:ascii="Lucida Grande" w:hAnsi="Lucida Grande" w:cs="Lucida Grande"/>
+          <w:color w:val="000000"/>
+          <w:sz w:val="21"/>
+          <w:szCs w:val="21"/>
+        </w:rPr>
         <w:br/>
       </w:r>
       <w:r>
@@ -2589,7 +2829,7 @@
         <w:pStyle w:val="NormalWeb"/>
         <w:rPr>
           <w:rFonts w:ascii="Lucida Grande" w:hAnsi="Lucida Grande" w:cs="Lucida Grande"/>
-          <w:color w:val="156082" w:themeColor="accent1"/>
+          <w:color w:val="0070C0"/>
           <w:sz w:val="21"/>
           <w:szCs w:val="21"/>
           <w:shd w:val="clear" w:color="auto" w:fill="FFFFFF"/>
@@ -2603,17 +2843,27 @@
           <w:szCs w:val="21"/>
           <w:shd w:val="clear" w:color="auto" w:fill="FFFFFF"/>
         </w:rPr>
-        <w:t xml:space="preserve">In practical applications we considered dealing with this with the First-Best and the Last-Best variants, which behave differently once they encounter two or more solutions with the same best seen fitness. The option you are proposing i.e., the best is the closest would be a further alternative. </w:t>
-      </w:r>
-      <w:r>
-        <w:rPr>
-          <w:rFonts w:ascii="Lucida Grande" w:hAnsi="Lucida Grande" w:cs="Lucida Grande"/>
-          <w:color w:val="EE0000"/>
-          <w:sz w:val="21"/>
-          <w:szCs w:val="21"/>
-          <w:shd w:val="clear" w:color="auto" w:fill="FFFFFF"/>
-        </w:rPr>
-        <w:t>Dogan? How would this perform on our functions?</w:t>
+        <w:t xml:space="preserve">In practical applications we considered dealing with this with the First-Best and the Last-Best variants, which behave differently once they encounter two or more solutions with the same best seen fitness. The option you are proposing i.e., the best is the closest would be a further </w:t>
+      </w:r>
+      <w:r>
+        <w:rPr>
+          <w:rFonts w:ascii="Lucida Grande" w:hAnsi="Lucida Grande" w:cs="Lucida Grande"/>
+          <w:color w:val="0070C0"/>
+          <w:sz w:val="21"/>
+          <w:szCs w:val="21"/>
+          <w:shd w:val="clear" w:color="auto" w:fill="FFFFFF"/>
+        </w:rPr>
+        <w:t xml:space="preserve">interesting </w:t>
+      </w:r>
+      <w:r>
+        <w:rPr>
+          <w:rFonts w:ascii="Lucida Grande" w:hAnsi="Lucida Grande" w:cs="Lucida Grande"/>
+          <w:color w:val="0070C0"/>
+          <w:sz w:val="21"/>
+          <w:szCs w:val="21"/>
+          <w:shd w:val="clear" w:color="auto" w:fill="FFFFFF"/>
+        </w:rPr>
+        <w:t>alternative.</w:t>
       </w:r>
     </w:p>
     <w:p>
@@ -2621,7 +2871,7 @@
         <w:pStyle w:val="NormalWeb"/>
         <w:rPr>
           <w:rFonts w:ascii="Lucida Grande" w:hAnsi="Lucida Grande" w:cs="Lucida Grande"/>
-          <w:color w:val="000000"/>
+          <w:color w:val="156082" w:themeColor="accent1"/>
           <w:sz w:val="21"/>
           <w:szCs w:val="21"/>
           <w:shd w:val="clear" w:color="auto" w:fill="FFFFFF"/>
@@ -2630,21 +2880,54 @@
       <w:r>
         <w:rPr>
           <w:rFonts w:ascii="Lucida Grande" w:hAnsi="Lucida Grande" w:cs="Lucida Grande"/>
-          <w:color w:val="000000"/>
-          <w:sz w:val="21"/>
-          <w:szCs w:val="21"/>
-        </w:rPr>
-        <w:br/>
-      </w:r>
-      <w:r>
-        <w:rPr>
-          <w:rFonts w:ascii="Lucida Grande" w:hAnsi="Lucida Grande" w:cs="Lucida Grande"/>
-          <w:color w:val="000000"/>
-          <w:sz w:val="21"/>
-          <w:szCs w:val="21"/>
-          <w:shd w:val="clear" w:color="auto" w:fill="FFFFFF"/>
-        </w:rPr>
-        <w:t xml:space="preserve">In Section IV, bounds are proved for OneMax and LeadingOnes. At least in the case of Theorems 6 and 7, the proofs simply rely on the age threshold being set large enough so that no individual dies before the optimum is found. Under these conditions, the Opt-IA-LastBest behaves identically to RLS since the mutation potential is never adjusted. Perhaps what would be interesting is to understand how the algorithms behave when the aging threshold is lower and they do not imitate RLS? Some discussion along these lines would be useful. </w:t>
+          <w:color w:val="00B050"/>
+          <w:sz w:val="21"/>
+          <w:szCs w:val="21"/>
+          <w:shd w:val="clear" w:color="auto" w:fill="FFFFFF"/>
+        </w:rPr>
+        <w:t>The ideal-condition analysis assumes a unique known optimum for unimodal functions. For multimodal use, our FirstBest/LastBest variants use H(x,best-so-far). The min-HD alternative is interesting future work.</w:t>
+      </w:r>
+    </w:p>
+    <w:p>
+      <w:pPr>
+        <w:pStyle w:val="NormalWeb"/>
+        <w:rPr>
+          <w:rFonts w:ascii="Lucida Grande" w:hAnsi="Lucida Grande" w:cs="Lucida Grande"/>
+          <w:color w:val="000000"/>
+          <w:sz w:val="21"/>
+          <w:szCs w:val="21"/>
+          <w:shd w:val="clear" w:color="auto" w:fill="FFFFFF"/>
+        </w:rPr>
+      </w:pPr>
+      <w:r>
+        <w:rPr>
+          <w:rFonts w:ascii="Lucida Grande" w:hAnsi="Lucida Grande" w:cs="Lucida Grande"/>
+          <w:color w:val="000000"/>
+          <w:sz w:val="21"/>
+          <w:szCs w:val="21"/>
+        </w:rPr>
+        <w:br/>
+      </w:r>
+      <w:r>
+        <w:rPr>
+          <w:rFonts w:ascii="Lucida Grande" w:hAnsi="Lucida Grande" w:cs="Lucida Grande"/>
+          <w:color w:val="000000"/>
+          <w:sz w:val="21"/>
+          <w:szCs w:val="21"/>
+          <w:shd w:val="clear" w:color="auto" w:fill="FFFFFF"/>
+        </w:rPr>
+        <w:t xml:space="preserve">In Section IV, bounds are proved for OneMax and LeadingOnes. At least in the case of </w:t>
+      </w:r>
+      <w:r>
+        <w:rPr>
+          <w:rFonts w:ascii="Lucida Grande" w:hAnsi="Lucida Grande" w:cs="Lucida Grande"/>
+          <w:color w:val="000000"/>
+          <w:sz w:val="21"/>
+          <w:szCs w:val="21"/>
+          <w:shd w:val="clear" w:color="auto" w:fill="FFFFFF"/>
+        </w:rPr>
+        <w:lastRenderedPageBreak/>
+        <w:t xml:space="preserve">Theorems 6 and 7, the proofs simply rely on the age threshold being set large enough so that no individual dies before the optimum is found. Under these conditions, the Opt-IA-LastBest behaves identically to RLS since the mutation potential is never adjusted. Perhaps what would be interesting is to understand how the algorithms behave when the aging threshold is lower and they do not imitate RLS? Some discussion along these lines would be useful. </w:t>
       </w:r>
     </w:p>
     <w:p>
@@ -2681,8 +2964,27 @@
           <w:szCs w:val="21"/>
           <w:shd w:val="clear" w:color="auto" w:fill="FFFFFF"/>
         </w:rPr>
-        <w:lastRenderedPageBreak/>
-        <w:t>In the literature the ageing operator has been established as a mechanism used to escape from local optima [ ]. Essentially its parameter \tau is set as the time the user is happy to try to escape via mutation before attempting other ways (restarting the individual or going for non-elitism). So it doesn’t make sense to fix the parameter tau to any time smaller than that required to confidently believe a local optima has been reached.  Wehave added “</w:t>
+        <w:t>In the literature the ageing operator has been established as a mechanism used to escape from local optima [</w:t>
+      </w:r>
+      <w:r>
+        <w:rPr>
+          <w:rFonts w:ascii="Lucida Grande" w:hAnsi="Lucida Grande" w:cs="Lucida Grande"/>
+          <w:color w:val="0070C0"/>
+          <w:sz w:val="21"/>
+          <w:szCs w:val="21"/>
+          <w:shd w:val="clear" w:color="auto" w:fill="FFFFFF"/>
+        </w:rPr>
+        <w:t>69,70,45</w:t>
+      </w:r>
+      <w:r>
+        <w:rPr>
+          <w:rFonts w:ascii="Lucida Grande" w:hAnsi="Lucida Grande" w:cs="Lucida Grande"/>
+          <w:color w:val="0070C0"/>
+          <w:sz w:val="21"/>
+          <w:szCs w:val="21"/>
+          <w:shd w:val="clear" w:color="auto" w:fill="FFFFFF"/>
+        </w:rPr>
+        <w:t xml:space="preserve"> ]. Essentially its parameter \tau is set as the time the user is happy to try to escape via mutation before attempting other ways (restarting the individual or going for non-elitism). So it doesn’t make sense to fix the parameter tau to any time smaller than that required to confidently believe a local optima has been reached.  Wehave added “</w:t>
       </w:r>
       <w:r>
         <w:rPr>
@@ -2836,7 +3138,6 @@
           <w:color w:val="000000"/>
           <w:sz w:val="21"/>
           <w:szCs w:val="21"/>
-          <w:shd w:val="clear" w:color="auto" w:fill="FFFFFF"/>
         </w:rPr>
       </w:pPr>
       <w:r>
@@ -2867,67 +3168,15 @@
           <w:szCs w:val="21"/>
         </w:rPr>
         <w:br/>
-        <w:br/>
-      </w:r>
-      <w:r>
-        <w:rPr>
-          <w:rFonts w:ascii="Lucida Grande" w:hAnsi="Lucida Grande" w:cs="Lucida Grande"/>
-          <w:color w:val="000000"/>
-          <w:sz w:val="21"/>
-          <w:szCs w:val="21"/>
-          <w:shd w:val="clear" w:color="auto" w:fill="FFFFFF"/>
-        </w:rPr>
-        <w:t xml:space="preserve">I am a bit puzzled by the lower bound in the proof of </w:t>
-      </w:r>
-      <w:r>
-        <w:rPr>
-          <w:rFonts w:ascii="Lucida Grande" w:hAnsi="Lucida Grande" w:cs="Lucida Grande"/>
-          <w:color w:val="E97132" w:themeColor="accent2"/>
-          <w:sz w:val="21"/>
-          <w:szCs w:val="21"/>
-          <w:shd w:val="clear" w:color="auto" w:fill="FFFFFF"/>
-        </w:rPr>
-        <w:t xml:space="preserve">Theorem 8. </w:t>
-      </w:r>
-      <w:r>
-        <w:rPr>
-          <w:rFonts w:ascii="Lucida Grande" w:hAnsi="Lucida Grande" w:cs="Lucida Grande"/>
-          <w:color w:val="000000"/>
-          <w:sz w:val="21"/>
-          <w:szCs w:val="21"/>
-          <w:shd w:val="clear" w:color="auto" w:fill="FFFFFF"/>
-        </w:rPr>
-        <w:t xml:space="preserve">I believe it is correct, but </w:t>
-      </w:r>
-      <w:r>
-        <w:rPr>
-          <w:rFonts w:ascii="Lucida Grande" w:hAnsi="Lucida Grande" w:cs="Lucida Grande"/>
-          <w:color w:val="E97132" w:themeColor="accent2"/>
-          <w:sz w:val="21"/>
-          <w:szCs w:val="21"/>
-          <w:shd w:val="clear" w:color="auto" w:fill="FFFFFF"/>
-        </w:rPr>
-        <w:t>I don't agree that level \ell+1 is always hit</w:t>
-      </w:r>
-      <w:r>
-        <w:rPr>
-          <w:rFonts w:ascii="Lucida Grande" w:hAnsi="Lucida Grande" w:cs="Lucida Grande"/>
-          <w:color w:val="000000"/>
-          <w:sz w:val="21"/>
-          <w:szCs w:val="21"/>
-          <w:shd w:val="clear" w:color="auto" w:fill="FFFFFF"/>
-        </w:rPr>
-        <w:t xml:space="preserve">. It would also be possible to overshoot \ell+1, and I'm missing an argument about the effect of so-called "free riders" beyond position \ell+1. Most probably these bits remain uniformly distributed under the first-best and so a superconstant jump will be exponentially unlikely; however this is not really handled in the current proof. </w:t>
-      </w:r>
-      <w:r>
-        <w:rPr>
-          <w:rFonts w:ascii="Lucida Grande" w:hAnsi="Lucida Grande" w:cs="Lucida Grande"/>
-          <w:color w:val="EE0000"/>
-          <w:sz w:val="21"/>
-          <w:szCs w:val="21"/>
-          <w:shd w:val="clear" w:color="auto" w:fill="FFFFFF"/>
-        </w:rPr>
-        <w:t>Dogan?</w:t>
+      </w:r>
+      <w:r>
+        <w:rPr>
+          <w:rFonts w:ascii="Lucida Grande" w:hAnsi="Lucida Grande" w:cs="Lucida Grande"/>
+          <w:color w:val="000000"/>
+          <w:sz w:val="21"/>
+          <w:szCs w:val="21"/>
+        </w:rPr>
+        <w:br/>
       </w:r>
       <w:r>
         <w:rPr>
@@ -2937,37 +3186,16 @@
           <w:szCs w:val="21"/>
           <w:shd w:val="clear" w:color="auto" w:fill="FFFFFF"/>
         </w:rPr>
-        <w:t xml:space="preserve"> Done. Added argument: tail bits are approximately unbiased, skip probability decays as 2^{-k}, so a constant fraction of levels are visited.</w:t>
-      </w:r>
-      <w:r>
-        <w:rPr>
-          <w:rFonts w:ascii="Lucida Grande" w:hAnsi="Lucida Grande" w:cs="Lucida Grande"/>
-          <w:color w:val="00B050"/>
-          <w:sz w:val="21"/>
-          <w:szCs w:val="21"/>
-          <w:shd w:val="clear" w:color="auto" w:fill="FFFFFF"/>
-        </w:rPr>
-        <w:t xml:space="preserve"> The ideal-condition analysis assumes a unique known optimum for unimodal functions. For multimodal use, our FirstBest/LastBest variants use H(x,best-so-far). The min-HD alternative is interesting future work.</w:t>
-      </w:r>
-      <w:r>
-        <w:rPr>
-          <w:rFonts w:ascii="Lucida Grande" w:hAnsi="Lucida Grande" w:cs="Lucida Grande"/>
-          <w:color w:val="000000"/>
-          <w:sz w:val="21"/>
-          <w:szCs w:val="21"/>
-        </w:rPr>
-        <w:br/>
-        <w:br/>
-      </w:r>
-      <w:r>
-        <w:rPr>
-          <w:rFonts w:ascii="Lucida Grande" w:hAnsi="Lucida Grande" w:cs="Lucida Grande"/>
-          <w:color w:val="000000"/>
-          <w:sz w:val="21"/>
-          <w:szCs w:val="21"/>
-          <w:shd w:val="clear" w:color="auto" w:fill="FFFFFF"/>
-        </w:rPr>
-        <w:t>Before Theorem 9, you mention that "fast-AIS" algorithms solve Cliff in O(n^(5/2) log n) time as long as the gap size is linear. Looking into the reference, I do find the result is proved for linear gap sizes, but I don't find any claims for sublinear gaps. I raise this issue because you then claim that, for sublinear gaps, the MlinHD with aging is faster than these fast AISs for sublinear gaps. As far as I can tell there do not seem to be any results for fast AIS on sublinear gaps which makes this comparison difficult to see. Most likely I've missed it, but it would be good to explicitly state a negative result to validate this comparison.</w:t>
+        <w:t xml:space="preserve"> Done. Simplified condition (ii) to just tau*p = o(1) and updated proofs of Theorems 6 and 7 accordingly.</w:t>
+      </w:r>
+      <w:r>
+        <w:rPr>
+          <w:rFonts w:ascii="Lucida Grande" w:hAnsi="Lucida Grande" w:cs="Lucida Grande"/>
+          <w:color w:val="000000"/>
+          <w:sz w:val="21"/>
+          <w:szCs w:val="21"/>
+        </w:rPr>
+        <w:br/>
       </w:r>
     </w:p>
     <w:p>
@@ -2975,7 +3203,7 @@
         <w:pStyle w:val="NormalWeb"/>
         <w:rPr>
           <w:rFonts w:ascii="Lucida Grande" w:hAnsi="Lucida Grande" w:cs="Lucida Grande"/>
-          <w:color w:val="000000"/>
+          <w:color w:val="EE0000"/>
           <w:sz w:val="21"/>
           <w:szCs w:val="21"/>
           <w:shd w:val="clear" w:color="auto" w:fill="FFFFFF"/>
@@ -2984,12 +3212,61 @@
       <w:r>
         <w:rPr>
           <w:rFonts w:ascii="Lucida Grande" w:hAnsi="Lucida Grande" w:cs="Lucida Grande"/>
-          <w:color w:val="0070C0"/>
-          <w:sz w:val="21"/>
-          <w:szCs w:val="21"/>
-          <w:shd w:val="clear" w:color="auto" w:fill="FFFFFF"/>
-        </w:rPr>
-        <w:t xml:space="preserve">Thanks for spotting this. “sublinear gaps” was a typo, we meant linear gaps there. </w:t>
+          <w:color w:val="000000"/>
+          <w:sz w:val="21"/>
+          <w:szCs w:val="21"/>
+        </w:rPr>
+        <w:br/>
+      </w:r>
+      <w:r>
+        <w:rPr>
+          <w:rFonts w:ascii="Lucida Grande" w:hAnsi="Lucida Grande" w:cs="Lucida Grande"/>
+          <w:color w:val="000000"/>
+          <w:sz w:val="21"/>
+          <w:szCs w:val="21"/>
+          <w:shd w:val="clear" w:color="auto" w:fill="FFFFFF"/>
+        </w:rPr>
+        <w:t xml:space="preserve">I am a bit puzzled by the lower bound in the proof of </w:t>
+      </w:r>
+      <w:r>
+        <w:rPr>
+          <w:rFonts w:ascii="Lucida Grande" w:hAnsi="Lucida Grande" w:cs="Lucida Grande"/>
+          <w:color w:val="E97132" w:themeColor="accent2"/>
+          <w:sz w:val="21"/>
+          <w:szCs w:val="21"/>
+          <w:shd w:val="clear" w:color="auto" w:fill="FFFFFF"/>
+        </w:rPr>
+        <w:t xml:space="preserve">Theorem 8. </w:t>
+      </w:r>
+      <w:r>
+        <w:rPr>
+          <w:rFonts w:ascii="Lucida Grande" w:hAnsi="Lucida Grande" w:cs="Lucida Grande"/>
+          <w:color w:val="000000"/>
+          <w:sz w:val="21"/>
+          <w:szCs w:val="21"/>
+          <w:shd w:val="clear" w:color="auto" w:fill="FFFFFF"/>
+        </w:rPr>
+        <w:t xml:space="preserve">I believe it is correct, but </w:t>
+      </w:r>
+      <w:r>
+        <w:rPr>
+          <w:rFonts w:ascii="Lucida Grande" w:hAnsi="Lucida Grande" w:cs="Lucida Grande"/>
+          <w:color w:val="E97132" w:themeColor="accent2"/>
+          <w:sz w:val="21"/>
+          <w:szCs w:val="21"/>
+          <w:shd w:val="clear" w:color="auto" w:fill="FFFFFF"/>
+        </w:rPr>
+        <w:t>I don't agree that level \ell+1 is always hit</w:t>
+      </w:r>
+      <w:r>
+        <w:rPr>
+          <w:rFonts w:ascii="Lucida Grande" w:hAnsi="Lucida Grande" w:cs="Lucida Grande"/>
+          <w:color w:val="000000"/>
+          <w:sz w:val="21"/>
+          <w:szCs w:val="21"/>
+          <w:shd w:val="clear" w:color="auto" w:fill="FFFFFF"/>
+        </w:rPr>
+        <w:t xml:space="preserve">. It would also be possible to overshoot \ell+1, and I'm missing an argument about the effect of so-called "free riders" beyond position \ell+1. Most probably these bits remain uniformly distributed under the first-best and so a superconstant jump will be exponentially unlikely; however this is not really handled in the current proof. </w:t>
       </w:r>
       <w:r>
         <w:rPr>
@@ -2999,7 +3276,7 @@
           <w:szCs w:val="21"/>
           <w:shd w:val="clear" w:color="auto" w:fill="FFFFFF"/>
         </w:rPr>
-        <w:t>Dogan check</w:t>
+        <w:t>Dogan?</w:t>
       </w:r>
       <w:r>
         <w:rPr>
@@ -3009,519 +3286,35 @@
           <w:szCs w:val="21"/>
           <w:shd w:val="clear" w:color="auto" w:fill="FFFFFF"/>
         </w:rPr>
-        <w:t xml:space="preserve"> Confirmed, this was a typo. Now corrected to "linear gaps."</w:t>
-      </w:r>
-      <w:r>
-        <w:rPr>
-          <w:rFonts w:ascii="Lucida Grande" w:hAnsi="Lucida Grande" w:cs="Lucida Grande"/>
-          <w:color w:val="000000"/>
-          <w:sz w:val="21"/>
-          <w:szCs w:val="21"/>
-        </w:rPr>
-        <w:br/>
-        <w:br/>
-      </w:r>
-      <w:r>
-        <w:rPr>
-          <w:rFonts w:ascii="Lucida Grande" w:hAnsi="Lucida Grande" w:cs="Lucida Grande"/>
-          <w:color w:val="000000"/>
-          <w:sz w:val="21"/>
-          <w:szCs w:val="21"/>
-          <w:shd w:val="clear" w:color="auto" w:fill="FFFFFF"/>
-        </w:rPr>
-        <w:t>In Section V, upper bounds are derived for Cliff, and they rely on waiting for a particular event to occur: the creation of a structured point beyond the cliff top. A large effort is spent deriving the probability this occurs, followed by the likelihood the potential does not increase too much during the subsequent climb to the optimum. I found the notation and argumentation to be a bit hasty in both Section V and VI (see detailed comments below).</w:t>
-      </w:r>
-      <w:r>
-        <w:rPr>
-          <w:rFonts w:ascii="Lucida Grande" w:hAnsi="Lucida Grande" w:cs="Lucida Grande"/>
-          <w:color w:val="000000"/>
-          <w:sz w:val="21"/>
-          <w:szCs w:val="21"/>
-        </w:rPr>
-        <w:br/>
-        <w:br/>
-      </w:r>
-      <w:r>
-        <w:rPr>
-          <w:rFonts w:ascii="Lucida Grande" w:hAnsi="Lucida Grande" w:cs="Lucida Grande"/>
-          <w:color w:val="000000"/>
-          <w:sz w:val="21"/>
-          <w:szCs w:val="21"/>
-          <w:shd w:val="clear" w:color="auto" w:fill="FFFFFF"/>
-        </w:rPr>
-        <w:t>DETAILED COMMENTS AND SUGGESTIONS</w:t>
-      </w:r>
-      <w:r>
-        <w:rPr>
-          <w:rFonts w:ascii="Lucida Grande" w:hAnsi="Lucida Grande" w:cs="Lucida Grande"/>
-          <w:color w:val="000000"/>
-          <w:sz w:val="21"/>
-          <w:szCs w:val="21"/>
-        </w:rPr>
-        <w:br/>
-        <w:br/>
-      </w:r>
-      <w:r>
-        <w:rPr>
-          <w:rFonts w:ascii="Lucida Grande" w:hAnsi="Lucida Grande" w:cs="Lucida Grande"/>
-          <w:color w:val="000000"/>
-          <w:sz w:val="21"/>
-          <w:szCs w:val="21"/>
-          <w:shd w:val="clear" w:color="auto" w:fill="FFFFFF"/>
-        </w:rPr>
-        <w:t xml:space="preserve">Page 4, column 1, line 3: better have f_OPT &gt; 0, otherwise M=cn always. </w:t>
-      </w:r>
-      <w:r>
-        <w:rPr>
-          <w:rFonts w:ascii="Lucida Grande" w:hAnsi="Lucida Grande" w:cs="Lucida Grande"/>
-          <w:color w:val="0070C0"/>
-          <w:sz w:val="21"/>
-          <w:szCs w:val="21"/>
-          <w:shd w:val="clear" w:color="auto" w:fill="FFFFFF"/>
-        </w:rPr>
-        <w:t>DONE</w:t>
-      </w:r>
-      <w:r>
-        <w:rPr>
-          <w:rFonts w:ascii="Lucida Grande" w:hAnsi="Lucida Grande" w:cs="Lucida Grande"/>
-          <w:color w:val="000000"/>
-          <w:sz w:val="21"/>
-          <w:szCs w:val="21"/>
-          <w:shd w:val="clear" w:color="auto" w:fill="FFFFFF"/>
-        </w:rPr>
-        <w:t xml:space="preserve"> </w:t>
-      </w:r>
-      <w:r>
-        <w:rPr>
-          <w:rFonts w:ascii="Lucida Grande" w:hAnsi="Lucida Grande" w:cs="Lucida Grande"/>
-          <w:color w:val="EE0000"/>
-          <w:sz w:val="21"/>
-          <w:szCs w:val="21"/>
-          <w:shd w:val="clear" w:color="auto" w:fill="FFFFFF"/>
-        </w:rPr>
-        <w:t>Dogan check</w:t>
-      </w:r>
-      <w:r>
-        <w:rPr>
-          <w:rFonts w:ascii="Lucida Grande" w:hAnsi="Lucida Grande" w:cs="Lucida Grande"/>
-          <w:color w:val="00B050"/>
-          <w:sz w:val="21"/>
-          <w:szCs w:val="21"/>
-          <w:shd w:val="clear" w:color="auto" w:fill="FFFFFF"/>
-        </w:rPr>
-        <w:t xml:space="preserve"> Checked and confirmed correct.</w:t>
-      </w:r>
-      <w:r>
-        <w:rPr>
-          <w:rFonts w:ascii="Lucida Grande" w:hAnsi="Lucida Grande" w:cs="Lucida Grande"/>
-          <w:color w:val="000000"/>
-          <w:sz w:val="21"/>
-          <w:szCs w:val="21"/>
-        </w:rPr>
-        <w:br/>
-        <w:br/>
-      </w:r>
-      <w:r>
-        <w:rPr>
-          <w:rFonts w:ascii="Lucida Grande" w:hAnsi="Lucida Grande" w:cs="Lucida Grande"/>
-          <w:color w:val="000000"/>
-          <w:sz w:val="21"/>
-          <w:szCs w:val="21"/>
-          <w:shd w:val="clear" w:color="auto" w:fill="FFFFFF"/>
-        </w:rPr>
-        <w:t xml:space="preserve">Page 4, column 2, final paragraph: "Otherwise it returns the last constructed solution". I </w:t>
-        <w:lastRenderedPageBreak/>
-        <w:t xml:space="preserve">recommend using the word "final" instead of "last", as last could also mean "previous", which is not what you mean. </w:t>
-      </w:r>
-      <w:r>
-        <w:rPr>
-          <w:rFonts w:ascii="Lucida Grande" w:hAnsi="Lucida Grande" w:cs="Lucida Grande"/>
-          <w:color w:val="0070C0"/>
-          <w:sz w:val="21"/>
-          <w:szCs w:val="21"/>
-          <w:shd w:val="clear" w:color="auto" w:fill="FFFFFF"/>
-        </w:rPr>
-        <w:t>DONE</w:t>
-      </w:r>
-      <w:r>
-        <w:rPr>
-          <w:rFonts w:ascii="Lucida Grande" w:hAnsi="Lucida Grande" w:cs="Lucida Grande"/>
-          <w:color w:val="000000"/>
-          <w:sz w:val="21"/>
-          <w:szCs w:val="21"/>
-        </w:rPr>
-        <w:br/>
-        <w:br/>
-      </w:r>
-      <w:r>
-        <w:rPr>
-          <w:rFonts w:ascii="Lucida Grande" w:hAnsi="Lucida Grande" w:cs="Lucida Grande"/>
-          <w:color w:val="000000"/>
-          <w:sz w:val="21"/>
-          <w:szCs w:val="21"/>
-          <w:shd w:val="clear" w:color="auto" w:fill="FFFFFF"/>
-        </w:rPr>
-        <w:t xml:space="preserve">Proof of Theorem 1, second line: "first step" -&gt; "first hypermutation step". </w:t>
-      </w:r>
-      <w:r>
-        <w:rPr>
-          <w:rFonts w:ascii="Lucida Grande" w:hAnsi="Lucida Grande" w:cs="Lucida Grande"/>
-          <w:color w:val="0070C0"/>
-          <w:sz w:val="21"/>
-          <w:szCs w:val="21"/>
-          <w:shd w:val="clear" w:color="auto" w:fill="FFFFFF"/>
-        </w:rPr>
-        <w:t>DONE</w:t>
-      </w:r>
-      <w:r>
-        <w:rPr>
-          <w:rFonts w:ascii="Lucida Grande" w:hAnsi="Lucida Grande" w:cs="Lucida Grande"/>
-          <w:color w:val="000000"/>
-          <w:sz w:val="21"/>
-          <w:szCs w:val="21"/>
-        </w:rPr>
-        <w:br/>
-        <w:br/>
-      </w:r>
-      <w:r>
-        <w:rPr>
-          <w:rFonts w:ascii="Lucida Grande" w:hAnsi="Lucida Grande" w:cs="Lucida Grande"/>
-          <w:color w:val="000000"/>
-          <w:sz w:val="21"/>
-          <w:szCs w:val="21"/>
-          <w:shd w:val="clear" w:color="auto" w:fill="FFFFFF"/>
-        </w:rPr>
-        <w:t xml:space="preserve">Page 6, column 1, top: </w:t>
-      </w:r>
-      <w:r>
-        <w:rPr>
-          <w:rFonts w:ascii="Lucida Grande" w:hAnsi="Lucida Grande" w:cs="Lucida Grande"/>
-          <w:color w:val="EE0000"/>
-          <w:sz w:val="21"/>
-          <w:szCs w:val="21"/>
-          <w:shd w:val="clear" w:color="auto" w:fill="FFFFFF"/>
-        </w:rPr>
-        <w:t xml:space="preserve">please clarify what you mean by "this unfortunate event". </w:t>
-      </w:r>
-      <w:r>
-        <w:rPr>
-          <w:rFonts w:ascii="Lucida Grande" w:hAnsi="Lucida Grande" w:cs="Lucida Grande"/>
-          <w:color w:val="000000"/>
-          <w:sz w:val="21"/>
-          <w:szCs w:val="21"/>
-          <w:shd w:val="clear" w:color="auto" w:fill="FFFFFF"/>
-        </w:rPr>
-        <w:t xml:space="preserve">Does that mean the event in which all M bits are flipped? </w:t>
-      </w:r>
-      <w:r>
-        <w:rPr>
-          <w:rFonts w:ascii="Lucida Grande" w:hAnsi="Lucida Grande" w:cs="Lucida Grande"/>
-          <w:color w:val="EE0000"/>
-          <w:sz w:val="21"/>
-          <w:szCs w:val="21"/>
-          <w:shd w:val="clear" w:color="auto" w:fill="FFFFFF"/>
-        </w:rPr>
-        <w:t>Dogan?</w:t>
-      </w:r>
-      <w:r>
-        <w:rPr>
-          <w:rFonts w:ascii="Lucida Grande" w:hAnsi="Lucida Grande" w:cs="Lucida Grande"/>
-          <w:color w:val="000000"/>
-          <w:sz w:val="21"/>
-          <w:szCs w:val="21"/>
-        </w:rPr>
-        <w:br/>
-        <w:br/>
-      </w:r>
-      <w:r>
-        <w:rPr>
-          <w:rFonts w:ascii="Lucida Grande" w:hAnsi="Lucida Grande" w:cs="Lucida Grande"/>
-          <w:color w:val="000000"/>
-          <w:sz w:val="21"/>
-          <w:szCs w:val="21"/>
-          <w:shd w:val="clear" w:color="auto" w:fill="FFFFFF"/>
-        </w:rPr>
-        <w:t xml:space="preserve">Page 8, before equation (2), minor nitpick, but x = 1-o(1). </w:t>
-      </w:r>
-      <w:r>
-        <w:rPr>
-          <w:rFonts w:ascii="Lucida Grande" w:hAnsi="Lucida Grande" w:cs="Lucida Grande"/>
-          <w:color w:val="EE0000"/>
-          <w:sz w:val="21"/>
-          <w:szCs w:val="21"/>
-          <w:shd w:val="clear" w:color="auto" w:fill="FFFFFF"/>
-        </w:rPr>
-        <w:t>Dogan?</w:t>
-      </w:r>
-      <w:r>
-        <w:rPr>
-          <w:rFonts w:ascii="Lucida Grande" w:hAnsi="Lucida Grande" w:cs="Lucida Grande"/>
-          <w:color w:val="00B050"/>
-          <w:sz w:val="21"/>
-          <w:szCs w:val="21"/>
-          <w:shd w:val="clear" w:color="auto" w:fill="FFFFFF"/>
-        </w:rPr>
-        <w:t xml:space="preserve"> Done. Added note (x = 1-o(1)) after the definition.</w:t>
-      </w:r>
-      <w:r>
-        <w:rPr>
-          <w:rFonts w:ascii="Lucida Grande" w:hAnsi="Lucida Grande" w:cs="Lucida Grande"/>
-          <w:color w:val="000000"/>
-          <w:sz w:val="21"/>
-          <w:szCs w:val="21"/>
-        </w:rPr>
-        <w:br/>
-        <w:br/>
-      </w:r>
-      <w:r>
-        <w:rPr>
-          <w:rFonts w:ascii="Lucida Grande" w:hAnsi="Lucida Grande" w:cs="Lucida Grande"/>
-          <w:color w:val="000000"/>
-          <w:sz w:val="21"/>
-          <w:szCs w:val="21"/>
-          <w:shd w:val="clear" w:color="auto" w:fill="FFFFFF"/>
-        </w:rPr>
-        <w:t xml:space="preserve">Page 9, column 2, second paragraph, "with initial age zero" -&gt; "with an initial age of zero". Fourth paragraph: I suppose you would also want a strict lower bound of zero for the c parameter, otherwise M=1 always. </w:t>
-      </w:r>
-      <w:r>
-        <w:rPr>
-          <w:rFonts w:ascii="Lucida Grande" w:hAnsi="Lucida Grande" w:cs="Lucida Grande"/>
-          <w:color w:val="0070C0"/>
-          <w:sz w:val="21"/>
-          <w:szCs w:val="21"/>
-          <w:shd w:val="clear" w:color="auto" w:fill="FFFFFF"/>
-        </w:rPr>
-        <w:t xml:space="preserve">DONE and DONE  </w:t>
-      </w:r>
-      <w:r>
-        <w:rPr>
-          <w:rFonts w:ascii="Lucida Grande" w:hAnsi="Lucida Grande" w:cs="Lucida Grande"/>
-          <w:color w:val="EE0000"/>
-          <w:sz w:val="21"/>
-          <w:szCs w:val="21"/>
-          <w:shd w:val="clear" w:color="auto" w:fill="FFFFFF"/>
-        </w:rPr>
-        <w:t>Dogan check</w:t>
-      </w:r>
-      <w:r>
-        <w:rPr>
-          <w:rFonts w:ascii="Lucida Grande" w:hAnsi="Lucida Grande" w:cs="Lucida Grande"/>
-          <w:color w:val="00B050"/>
-          <w:sz w:val="21"/>
-          <w:szCs w:val="21"/>
-          <w:shd w:val="clear" w:color="auto" w:fill="FFFFFF"/>
-        </w:rPr>
-        <w:t xml:space="preserve"> Checked and confirmed correct.</w:t>
-      </w:r>
-      <w:r>
-        <w:rPr>
-          <w:rFonts w:ascii="Lucida Grande" w:hAnsi="Lucida Grande" w:cs="Lucida Grande"/>
-          <w:color w:val="000000"/>
-          <w:sz w:val="21"/>
-          <w:szCs w:val="21"/>
-        </w:rPr>
-        <w:br/>
-        <w:br/>
-      </w:r>
-      <w:r>
-        <w:rPr>
-          <w:rFonts w:ascii="Lucida Grande" w:hAnsi="Lucida Grande" w:cs="Lucida Grande"/>
-          <w:color w:val="000000"/>
-          <w:sz w:val="21"/>
-          <w:szCs w:val="21"/>
-          <w:shd w:val="clear" w:color="auto" w:fill="FFFFFF"/>
-        </w:rPr>
-        <w:t xml:space="preserve">Proof of Theorem 6, it's strange to have both M=0 and M=1 in the same sentence. Suggest stating that cH=0 so that M=max(0,1)=1. </w:t>
-      </w:r>
-      <w:r>
-        <w:rPr>
-          <w:rFonts w:ascii="Lucida Grande" w:hAnsi="Lucida Grande" w:cs="Lucida Grande"/>
-          <w:color w:val="EE0000"/>
-          <w:sz w:val="21"/>
-          <w:szCs w:val="21"/>
-          <w:shd w:val="clear" w:color="auto" w:fill="FFFFFF"/>
-        </w:rPr>
-        <w:t>Dogan?</w:t>
-      </w:r>
-      <w:r>
-        <w:rPr>
-          <w:rFonts w:ascii="Lucida Grande" w:hAnsi="Lucida Grande" w:cs="Lucida Grande"/>
-          <w:color w:val="00B050"/>
-          <w:sz w:val="21"/>
-          <w:szCs w:val="21"/>
-          <w:shd w:val="clear" w:color="auto" w:fill="FFFFFF"/>
-        </w:rPr>
-        <w:t xml:space="preserve"> Done. Changed to cH=0, so M=max(cH,1)=max(0,1)=1.</w:t>
-      </w:r>
-      <w:r>
-        <w:rPr>
-          <w:rFonts w:ascii="Lucida Grande" w:hAnsi="Lucida Grande" w:cs="Lucida Grande"/>
-          <w:color w:val="000000"/>
-          <w:sz w:val="21"/>
-          <w:szCs w:val="21"/>
-        </w:rPr>
-        <w:br/>
-        <w:br/>
-      </w:r>
-      <w:r>
-        <w:rPr>
-          <w:rFonts w:ascii="Lucida Grande" w:hAnsi="Lucida Grande" w:cs="Lucida Grande"/>
-          <w:color w:val="000000"/>
-          <w:sz w:val="21"/>
-          <w:szCs w:val="21"/>
-          <w:shd w:val="clear" w:color="auto" w:fill="FFFFFF"/>
-        </w:rPr>
-        <w:t xml:space="preserve">Proof of Theorem 8, something odd is happening with math spacing in the first line. </w:t>
-      </w:r>
-      <w:r>
-        <w:rPr>
-          <w:rFonts w:ascii="Lucida Grande" w:hAnsi="Lucida Grande" w:cs="Lucida Grande"/>
-          <w:color w:val="0070C0"/>
-          <w:sz w:val="21"/>
-          <w:szCs w:val="21"/>
-          <w:shd w:val="clear" w:color="auto" w:fill="FFFFFF"/>
-        </w:rPr>
-        <w:t>DONE</w:t>
-      </w:r>
-      <w:r>
-        <w:rPr>
-          <w:rFonts w:ascii="Lucida Grande" w:hAnsi="Lucida Grande" w:cs="Lucida Grande"/>
-          <w:color w:val="000000"/>
-          <w:sz w:val="21"/>
-          <w:szCs w:val="21"/>
-        </w:rPr>
-        <w:br/>
-        <w:br/>
-      </w:r>
-      <w:r>
-        <w:rPr>
-          <w:rFonts w:ascii="Lucida Grande" w:hAnsi="Lucida Grande" w:cs="Lucida Grande"/>
-          <w:color w:val="000000"/>
-          <w:sz w:val="21"/>
-          <w:szCs w:val="21"/>
-          <w:shd w:val="clear" w:color="auto" w:fill="FFFFFF"/>
-        </w:rPr>
-        <w:t xml:space="preserve">Lemma 4: I'm missing a factor of (1/2) somewhere (I get a leading constant of 3/128). </w:t>
-      </w:r>
-      <w:r>
-        <w:rPr>
-          <w:rFonts w:ascii="Lucida Grande" w:hAnsi="Lucida Grande" w:cs="Lucida Grande"/>
-          <w:color w:val="EE0000"/>
-          <w:sz w:val="21"/>
-          <w:szCs w:val="21"/>
-          <w:shd w:val="clear" w:color="auto" w:fill="FFFFFF"/>
-        </w:rPr>
-        <w:t>Dogan?</w:t>
-      </w:r>
-      <w:r>
-        <w:rPr>
-          <w:rFonts w:ascii="Lucida Grande" w:hAnsi="Lucida Grande" w:cs="Lucida Grande"/>
-          <w:color w:val="00B050"/>
-          <w:sz w:val="21"/>
-          <w:szCs w:val="21"/>
-          <w:shd w:val="clear" w:color="auto" w:fill="FFFFFF"/>
-        </w:rPr>
-        <w:t xml:space="preserve"> Done. Corrected 3/256 to 3/128. The extra 1/2 was unnecessary since we wait for the first death event.</w:t>
-      </w:r>
-      <w:r>
-        <w:rPr>
-          <w:rFonts w:ascii="Lucida Grande" w:hAnsi="Lucida Grande" w:cs="Lucida Grande"/>
-          <w:color w:val="000000"/>
-          <w:sz w:val="21"/>
-          <w:szCs w:val="21"/>
-        </w:rPr>
-        <w:br/>
-        <w:br/>
-      </w:r>
-      <w:r>
-        <w:rPr>
-          <w:rFonts w:ascii="Lucida Grande" w:hAnsi="Lucida Grande" w:cs="Lucida Grande"/>
-          <w:color w:val="000000"/>
-          <w:sz w:val="21"/>
-          <w:szCs w:val="21"/>
-          <w:shd w:val="clear" w:color="auto" w:fill="FFFFFF"/>
-        </w:rPr>
-        <w:t xml:space="preserve">Proof of Lemma 5: what do you mean by "Step 1"? I guess the displayed equation? Better to use a tag and eqref. </w:t>
-      </w:r>
-      <w:r>
-        <w:rPr>
-          <w:rFonts w:ascii="Lucida Grande" w:hAnsi="Lucida Grande" w:cs="Lucida Grande"/>
-          <w:color w:val="EE0000"/>
-          <w:sz w:val="21"/>
-          <w:szCs w:val="21"/>
-          <w:shd w:val="clear" w:color="auto" w:fill="FFFFFF"/>
-        </w:rPr>
-        <w:t>Dogan?</w:t>
-      </w:r>
-      <w:r>
-        <w:rPr>
-          <w:rFonts w:ascii="Lucida Grande" w:hAnsi="Lucida Grande" w:cs="Lucida Grande"/>
-          <w:color w:val="00B050"/>
-          <w:sz w:val="21"/>
-          <w:szCs w:val="21"/>
-          <w:shd w:val="clear" w:color="auto" w:fill="FFFFFF"/>
-        </w:rPr>
-        <w:t xml:space="preserve"> Done. Labelled the equation and replaced 'By Step 1' with eqref.</w:t>
-      </w:r>
-      <w:r>
-        <w:rPr>
-          <w:rFonts w:ascii="Lucida Grande" w:hAnsi="Lucida Grande" w:cs="Lucida Grande"/>
-          <w:color w:val="000000"/>
-          <w:sz w:val="21"/>
-          <w:szCs w:val="21"/>
-        </w:rPr>
-        <w:br/>
-        <w:br/>
-      </w:r>
-      <w:r>
-        <w:rPr>
-          <w:rFonts w:ascii="Lucida Grande" w:hAnsi="Lucida Grande" w:cs="Lucida Grande"/>
-          <w:color w:val="000000"/>
-          <w:sz w:val="21"/>
-          <w:szCs w:val="21"/>
-          <w:shd w:val="clear" w:color="auto" w:fill="FFFFFF"/>
-        </w:rPr>
-        <w:t xml:space="preserve">Page 14: I suggest explicitly defining \Delta_{fail} and \Delta^{succ}_z before they are used in the proofs of Lemmas 6 and 7. I guess also that \Delta^(i)_{fail} is the change in Hamming distance during the i-th failed attempt? </w:t>
-      </w:r>
-      <w:r>
-        <w:rPr>
-          <w:rFonts w:ascii="Lucida Grande" w:hAnsi="Lucida Grande" w:cs="Lucida Grande"/>
-          <w:color w:val="EE0000"/>
-          <w:sz w:val="21"/>
-          <w:szCs w:val="21"/>
-          <w:shd w:val="clear" w:color="auto" w:fill="FFFFFF"/>
-        </w:rPr>
-        <w:t>Dogan?</w:t>
-      </w:r>
-      <w:r>
-        <w:rPr>
-          <w:rFonts w:ascii="Lucida Grande" w:hAnsi="Lucida Grande" w:cs="Lucida Grande"/>
-          <w:color w:val="00B050"/>
-          <w:sz w:val="21"/>
-          <w:szCs w:val="21"/>
-          <w:shd w:val="clear" w:color="auto" w:fill="FFFFFF"/>
-        </w:rPr>
-        <w:t xml:space="preserve"> Done. Added explicit definitions for Delta_fail and Delta^succ_z before first use.</w:t>
-      </w:r>
-      <w:r>
-        <w:rPr>
-          <w:rFonts w:ascii="Lucida Grande" w:hAnsi="Lucida Grande" w:cs="Lucida Grande"/>
-          <w:color w:val="000000"/>
-          <w:sz w:val="21"/>
-          <w:szCs w:val="21"/>
-        </w:rPr>
-        <w:br/>
-        <w:br/>
-      </w:r>
-      <w:r>
-        <w:rPr>
-          <w:rFonts w:ascii="Lucida Grande" w:hAnsi="Lucida Grande" w:cs="Lucida Grande"/>
-          <w:color w:val="000000"/>
-          <w:sz w:val="21"/>
-          <w:szCs w:val="21"/>
-          <w:shd w:val="clear" w:color="auto" w:fill="FFFFFF"/>
-        </w:rPr>
-        <w:t>In several proofs (of Lemma 6, Lemma 8 and Theorem 11 for example), there is an inconsistent use of notation for expectation. Sometimes blackboard bold is used, sometimes not.</w:t>
+        <w:t xml:space="preserve"> Done. Added argument: tail bits are approximately unbiased, skip probability decays as 2^{-k}, so a constant fraction of levels are visited. </w:t>
+      </w:r>
+      <w:r>
+        <w:rPr>
+          <w:rFonts w:ascii="Lucida Grande" w:hAnsi="Lucida Grande" w:cs="Lucida Grande"/>
+          <w:color w:val="000000"/>
+          <w:sz w:val="21"/>
+          <w:szCs w:val="21"/>
+        </w:rPr>
+        <w:br/>
+      </w:r>
+      <w:r>
+        <w:rPr>
+          <w:rFonts w:ascii="Lucida Grande" w:hAnsi="Lucida Grande" w:cs="Lucida Grande"/>
+          <w:color w:val="000000"/>
+          <w:sz w:val="21"/>
+          <w:szCs w:val="21"/>
+        </w:rPr>
+        <w:br/>
+      </w:r>
+      <w:r>
+        <w:rPr>
+          <w:rFonts w:ascii="Lucida Grande" w:hAnsi="Lucida Grande" w:cs="Lucida Grande"/>
+          <w:color w:val="000000"/>
+          <w:sz w:val="21"/>
+          <w:szCs w:val="21"/>
+          <w:shd w:val="clear" w:color="auto" w:fill="FFFFFF"/>
+        </w:rPr>
+        <w:t>Before Theorem 9, you mention that "fast-AIS" algorithms solve Cliff in O(n^(5/2) log n) time as long as the gap size is linear. Looking into the reference, I do find the result is proved for linear gap sizes, but I don't find any claims for sublinear gaps. I raise this issue because you then claim that, for sublinear gaps, the MlinHD with aging is faster than these fast AISs for sublinear gaps. As far as I can tell there do not seem to be any results for fast AIS on sublinear gaps which makes this comparison difficult to see. Most likely I've missed it, but it would be good to explicitly state a negative result to validate this comparison.</w:t>
       </w:r>
     </w:p>
     <w:p>
@@ -3529,11 +3322,676 @@
         <w:pStyle w:val="NormalWeb"/>
         <w:rPr>
           <w:rFonts w:ascii="Lucida Grande" w:hAnsi="Lucida Grande" w:cs="Lucida Grande"/>
+          <w:color w:val="000000"/>
+          <w:sz w:val="21"/>
+          <w:szCs w:val="21"/>
+          <w:shd w:val="clear" w:color="auto" w:fill="FFFFFF"/>
+        </w:rPr>
+      </w:pPr>
+      <w:r>
+        <w:rPr>
+          <w:rFonts w:ascii="Lucida Grande" w:hAnsi="Lucida Grande" w:cs="Lucida Grande"/>
           <w:color w:val="0070C0"/>
           <w:sz w:val="21"/>
           <w:szCs w:val="21"/>
           <w:shd w:val="clear" w:color="auto" w:fill="FFFFFF"/>
         </w:rPr>
+        <w:lastRenderedPageBreak/>
+        <w:t xml:space="preserve">Thanks for spotting this. “sublinear gaps” was a typo, we meant linear gaps there. </w:t>
+      </w:r>
+      <w:r>
+        <w:rPr>
+          <w:rFonts w:ascii="Lucida Grande" w:hAnsi="Lucida Grande" w:cs="Lucida Grande"/>
+          <w:color w:val="EE0000"/>
+          <w:sz w:val="21"/>
+          <w:szCs w:val="21"/>
+          <w:shd w:val="clear" w:color="auto" w:fill="FFFFFF"/>
+        </w:rPr>
+        <w:t>Dogan check</w:t>
+      </w:r>
+      <w:r>
+        <w:rPr>
+          <w:rFonts w:ascii="Lucida Grande" w:hAnsi="Lucida Grande" w:cs="Lucida Grande"/>
+          <w:color w:val="00B050"/>
+          <w:sz w:val="21"/>
+          <w:szCs w:val="21"/>
+          <w:shd w:val="clear" w:color="auto" w:fill="FFFFFF"/>
+        </w:rPr>
+        <w:t xml:space="preserve"> Confirmed, this was a typo. Now corrected to "linear gaps."</w:t>
+      </w:r>
+      <w:r>
+        <w:rPr>
+          <w:rFonts w:ascii="Lucida Grande" w:hAnsi="Lucida Grande" w:cs="Lucida Grande"/>
+          <w:color w:val="000000"/>
+          <w:sz w:val="21"/>
+          <w:szCs w:val="21"/>
+        </w:rPr>
+        <w:br/>
+      </w:r>
+      <w:r>
+        <w:rPr>
+          <w:rFonts w:ascii="Lucida Grande" w:hAnsi="Lucida Grande" w:cs="Lucida Grande"/>
+          <w:color w:val="000000"/>
+          <w:sz w:val="21"/>
+          <w:szCs w:val="21"/>
+        </w:rPr>
+        <w:br/>
+      </w:r>
+      <w:r>
+        <w:rPr>
+          <w:rFonts w:ascii="Lucida Grande" w:hAnsi="Lucida Grande" w:cs="Lucida Grande"/>
+          <w:color w:val="000000"/>
+          <w:sz w:val="21"/>
+          <w:szCs w:val="21"/>
+          <w:shd w:val="clear" w:color="auto" w:fill="FFFFFF"/>
+        </w:rPr>
+        <w:t>In Section V, upper bounds are derived for Cliff, and they rely on waiting for a particular event to occur: the creation of a structured point beyond the cliff top. A large effort is spent deriving the probability this occurs, followed by the likelihood the potential does not increase too much during the subsequent climb to the optimum. I found the notation and argumentation to be a bit hasty in both Section V and VI (see detailed comments below).</w:t>
+      </w:r>
+      <w:r>
+        <w:rPr>
+          <w:rFonts w:ascii="Lucida Grande" w:hAnsi="Lucida Grande" w:cs="Lucida Grande"/>
+          <w:color w:val="000000"/>
+          <w:sz w:val="21"/>
+          <w:szCs w:val="21"/>
+        </w:rPr>
+        <w:br/>
+      </w:r>
+      <w:r>
+        <w:rPr>
+          <w:rFonts w:ascii="Lucida Grande" w:hAnsi="Lucida Grande" w:cs="Lucida Grande"/>
+          <w:color w:val="000000"/>
+          <w:sz w:val="21"/>
+          <w:szCs w:val="21"/>
+        </w:rPr>
+        <w:br/>
+      </w:r>
+      <w:r>
+        <w:rPr>
+          <w:rFonts w:ascii="Lucida Grande" w:hAnsi="Lucida Grande" w:cs="Lucida Grande"/>
+          <w:color w:val="000000"/>
+          <w:sz w:val="21"/>
+          <w:szCs w:val="21"/>
+          <w:shd w:val="clear" w:color="auto" w:fill="FFFFFF"/>
+        </w:rPr>
+        <w:t>DETAILED COMMENTS AND SUGGESTIONS</w:t>
+      </w:r>
+      <w:r>
+        <w:rPr>
+          <w:rFonts w:ascii="Lucida Grande" w:hAnsi="Lucida Grande" w:cs="Lucida Grande"/>
+          <w:color w:val="000000"/>
+          <w:sz w:val="21"/>
+          <w:szCs w:val="21"/>
+        </w:rPr>
+        <w:br/>
+      </w:r>
+      <w:r>
+        <w:rPr>
+          <w:rFonts w:ascii="Lucida Grande" w:hAnsi="Lucida Grande" w:cs="Lucida Grande"/>
+          <w:color w:val="000000"/>
+          <w:sz w:val="21"/>
+          <w:szCs w:val="21"/>
+        </w:rPr>
+        <w:br/>
+      </w:r>
+      <w:r>
+        <w:rPr>
+          <w:rFonts w:ascii="Lucida Grande" w:hAnsi="Lucida Grande" w:cs="Lucida Grande"/>
+          <w:color w:val="000000"/>
+          <w:sz w:val="21"/>
+          <w:szCs w:val="21"/>
+          <w:shd w:val="clear" w:color="auto" w:fill="FFFFFF"/>
+        </w:rPr>
+        <w:t xml:space="preserve">Page 4, column 1, line 3: better have f_OPT &gt; 0, otherwise M=cn always. </w:t>
+      </w:r>
+      <w:r>
+        <w:rPr>
+          <w:rFonts w:ascii="Lucida Grande" w:hAnsi="Lucida Grande" w:cs="Lucida Grande"/>
+          <w:color w:val="0070C0"/>
+          <w:sz w:val="21"/>
+          <w:szCs w:val="21"/>
+          <w:shd w:val="clear" w:color="auto" w:fill="FFFFFF"/>
+        </w:rPr>
+        <w:t>DONE</w:t>
+      </w:r>
+      <w:r>
+        <w:rPr>
+          <w:rFonts w:ascii="Lucida Grande" w:hAnsi="Lucida Grande" w:cs="Lucida Grande"/>
+          <w:color w:val="000000"/>
+          <w:sz w:val="21"/>
+          <w:szCs w:val="21"/>
+          <w:shd w:val="clear" w:color="auto" w:fill="FFFFFF"/>
+        </w:rPr>
+        <w:t xml:space="preserve"> </w:t>
+      </w:r>
+      <w:r>
+        <w:rPr>
+          <w:rFonts w:ascii="Lucida Grande" w:hAnsi="Lucida Grande" w:cs="Lucida Grande"/>
+          <w:color w:val="EE0000"/>
+          <w:sz w:val="21"/>
+          <w:szCs w:val="21"/>
+          <w:shd w:val="clear" w:color="auto" w:fill="FFFFFF"/>
+        </w:rPr>
+        <w:t>Dogan check</w:t>
+      </w:r>
+      <w:r>
+        <w:rPr>
+          <w:rFonts w:ascii="Lucida Grande" w:hAnsi="Lucida Grande" w:cs="Lucida Grande"/>
+          <w:color w:val="00B050"/>
+          <w:sz w:val="21"/>
+          <w:szCs w:val="21"/>
+          <w:shd w:val="clear" w:color="auto" w:fill="FFFFFF"/>
+        </w:rPr>
+        <w:t xml:space="preserve"> Checked and confirmed correct.</w:t>
+      </w:r>
+      <w:r>
+        <w:rPr>
+          <w:rFonts w:ascii="Lucida Grande" w:hAnsi="Lucida Grande" w:cs="Lucida Grande"/>
+          <w:color w:val="000000"/>
+          <w:sz w:val="21"/>
+          <w:szCs w:val="21"/>
+        </w:rPr>
+        <w:br/>
+      </w:r>
+      <w:r>
+        <w:rPr>
+          <w:rFonts w:ascii="Lucida Grande" w:hAnsi="Lucida Grande" w:cs="Lucida Grande"/>
+          <w:color w:val="000000"/>
+          <w:sz w:val="21"/>
+          <w:szCs w:val="21"/>
+        </w:rPr>
+        <w:br/>
+      </w:r>
+      <w:r>
+        <w:rPr>
+          <w:rFonts w:ascii="Lucida Grande" w:hAnsi="Lucida Grande" w:cs="Lucida Grande"/>
+          <w:color w:val="000000"/>
+          <w:sz w:val="21"/>
+          <w:szCs w:val="21"/>
+          <w:shd w:val="clear" w:color="auto" w:fill="FFFFFF"/>
+        </w:rPr>
+        <w:t xml:space="preserve">Page 4, column 2, final paragraph: "Otherwise it returns the last constructed solution". I recommend using the word "final" instead of "last", as last could also mean "previous", which is not what you mean. </w:t>
+      </w:r>
+      <w:r>
+        <w:rPr>
+          <w:rFonts w:ascii="Lucida Grande" w:hAnsi="Lucida Grande" w:cs="Lucida Grande"/>
+          <w:color w:val="0070C0"/>
+          <w:sz w:val="21"/>
+          <w:szCs w:val="21"/>
+          <w:shd w:val="clear" w:color="auto" w:fill="FFFFFF"/>
+        </w:rPr>
+        <w:t>DONE</w:t>
+      </w:r>
+      <w:r>
+        <w:rPr>
+          <w:rFonts w:ascii="Lucida Grande" w:hAnsi="Lucida Grande" w:cs="Lucida Grande"/>
+          <w:color w:val="000000"/>
+          <w:sz w:val="21"/>
+          <w:szCs w:val="21"/>
+        </w:rPr>
+        <w:br/>
+      </w:r>
+      <w:r>
+        <w:rPr>
+          <w:rFonts w:ascii="Lucida Grande" w:hAnsi="Lucida Grande" w:cs="Lucida Grande"/>
+          <w:color w:val="000000"/>
+          <w:sz w:val="21"/>
+          <w:szCs w:val="21"/>
+        </w:rPr>
+        <w:br/>
+      </w:r>
+      <w:r>
+        <w:rPr>
+          <w:rFonts w:ascii="Lucida Grande" w:hAnsi="Lucida Grande" w:cs="Lucida Grande"/>
+          <w:color w:val="000000"/>
+          <w:sz w:val="21"/>
+          <w:szCs w:val="21"/>
+          <w:shd w:val="clear" w:color="auto" w:fill="FFFFFF"/>
+        </w:rPr>
+        <w:t xml:space="preserve">Proof of Theorem 1, second line: "first step" -&gt; "first hypermutation step". </w:t>
+      </w:r>
+      <w:r>
+        <w:rPr>
+          <w:rFonts w:ascii="Lucida Grande" w:hAnsi="Lucida Grande" w:cs="Lucida Grande"/>
+          <w:color w:val="0070C0"/>
+          <w:sz w:val="21"/>
+          <w:szCs w:val="21"/>
+          <w:shd w:val="clear" w:color="auto" w:fill="FFFFFF"/>
+        </w:rPr>
+        <w:t>DONE</w:t>
+      </w:r>
+      <w:r>
+        <w:rPr>
+          <w:rFonts w:ascii="Lucida Grande" w:hAnsi="Lucida Grande" w:cs="Lucida Grande"/>
+          <w:color w:val="000000"/>
+          <w:sz w:val="21"/>
+          <w:szCs w:val="21"/>
+        </w:rPr>
+        <w:br/>
+      </w:r>
+      <w:r>
+        <w:rPr>
+          <w:rFonts w:ascii="Lucida Grande" w:hAnsi="Lucida Grande" w:cs="Lucida Grande"/>
+          <w:color w:val="000000"/>
+          <w:sz w:val="21"/>
+          <w:szCs w:val="21"/>
+        </w:rPr>
+        <w:br/>
+      </w:r>
+      <w:r>
+        <w:rPr>
+          <w:rFonts w:ascii="Lucida Grande" w:hAnsi="Lucida Grande" w:cs="Lucida Grande"/>
+          <w:color w:val="000000"/>
+          <w:sz w:val="21"/>
+          <w:szCs w:val="21"/>
+          <w:shd w:val="clear" w:color="auto" w:fill="FFFFFF"/>
+        </w:rPr>
+        <w:t xml:space="preserve">Page 6, column 1, top: </w:t>
+      </w:r>
+      <w:r>
+        <w:rPr>
+          <w:rFonts w:ascii="Lucida Grande" w:hAnsi="Lucida Grande" w:cs="Lucida Grande"/>
+          <w:color w:val="EE0000"/>
+          <w:sz w:val="21"/>
+          <w:szCs w:val="21"/>
+          <w:shd w:val="clear" w:color="auto" w:fill="FFFFFF"/>
+        </w:rPr>
+        <w:t xml:space="preserve">please clarify what you mean by "this unfortunate event". </w:t>
+      </w:r>
+      <w:r>
+        <w:rPr>
+          <w:rFonts w:ascii="Lucida Grande" w:hAnsi="Lucida Grande" w:cs="Lucida Grande"/>
+          <w:color w:val="000000"/>
+          <w:sz w:val="21"/>
+          <w:szCs w:val="21"/>
+          <w:shd w:val="clear" w:color="auto" w:fill="FFFFFF"/>
+        </w:rPr>
+        <w:t xml:space="preserve">Does that mean the event in which all M bits are flipped? </w:t>
+      </w:r>
+      <w:r>
+        <w:rPr>
+          <w:rFonts w:ascii="Lucida Grande" w:hAnsi="Lucida Grande" w:cs="Lucida Grande"/>
+          <w:color w:val="EE0000"/>
+          <w:sz w:val="21"/>
+          <w:szCs w:val="21"/>
+          <w:shd w:val="clear" w:color="auto" w:fill="FFFFFF"/>
+        </w:rPr>
+        <w:t>Dogan?</w:t>
+      </w:r>
+      <w:r>
+        <w:rPr>
+          <w:rFonts w:ascii="Lucida Grande" w:hAnsi="Lucida Grande" w:cs="Lucida Grande"/>
+          <w:color w:val="000000"/>
+          <w:sz w:val="21"/>
+          <w:szCs w:val="21"/>
+        </w:rPr>
+        <w:br/>
+      </w:r>
+      <w:r>
+        <w:rPr>
+          <w:rFonts w:ascii="Lucida Grande" w:hAnsi="Lucida Grande" w:cs="Lucida Grande"/>
+          <w:color w:val="000000"/>
+          <w:sz w:val="21"/>
+          <w:szCs w:val="21"/>
+        </w:rPr>
+        <w:br/>
+      </w:r>
+      <w:r>
+        <w:rPr>
+          <w:rFonts w:ascii="Lucida Grande" w:hAnsi="Lucida Grande" w:cs="Lucida Grande"/>
+          <w:color w:val="000000"/>
+          <w:sz w:val="21"/>
+          <w:szCs w:val="21"/>
+          <w:shd w:val="clear" w:color="auto" w:fill="FFFFFF"/>
+        </w:rPr>
+        <w:t xml:space="preserve">Page 8, before equation (2), minor nitpick, but x = 1-o(1). </w:t>
+      </w:r>
+      <w:r>
+        <w:rPr>
+          <w:rFonts w:ascii="Lucida Grande" w:hAnsi="Lucida Grande" w:cs="Lucida Grande"/>
+          <w:color w:val="EE0000"/>
+          <w:sz w:val="21"/>
+          <w:szCs w:val="21"/>
+          <w:shd w:val="clear" w:color="auto" w:fill="FFFFFF"/>
+        </w:rPr>
+        <w:t>Dogan?</w:t>
+      </w:r>
+      <w:r>
+        <w:rPr>
+          <w:rFonts w:ascii="Lucida Grande" w:hAnsi="Lucida Grande" w:cs="Lucida Grande"/>
+          <w:color w:val="00B050"/>
+          <w:sz w:val="21"/>
+          <w:szCs w:val="21"/>
+          <w:shd w:val="clear" w:color="auto" w:fill="FFFFFF"/>
+        </w:rPr>
+        <w:t xml:space="preserve"> Done. Added note (x = 1-o(1)) after the definition.</w:t>
+      </w:r>
+      <w:r>
+        <w:rPr>
+          <w:rFonts w:ascii="Lucida Grande" w:hAnsi="Lucida Grande" w:cs="Lucida Grande"/>
+          <w:color w:val="000000"/>
+          <w:sz w:val="21"/>
+          <w:szCs w:val="21"/>
+        </w:rPr>
+        <w:br/>
+      </w:r>
+      <w:r>
+        <w:rPr>
+          <w:rFonts w:ascii="Lucida Grande" w:hAnsi="Lucida Grande" w:cs="Lucida Grande"/>
+          <w:color w:val="000000"/>
+          <w:sz w:val="21"/>
+          <w:szCs w:val="21"/>
+        </w:rPr>
+        <w:br/>
+      </w:r>
+      <w:r>
+        <w:rPr>
+          <w:rFonts w:ascii="Lucida Grande" w:hAnsi="Lucida Grande" w:cs="Lucida Grande"/>
+          <w:color w:val="000000"/>
+          <w:sz w:val="21"/>
+          <w:szCs w:val="21"/>
+          <w:shd w:val="clear" w:color="auto" w:fill="FFFFFF"/>
+        </w:rPr>
+        <w:t xml:space="preserve">Page 9, column 2, second paragraph, "with initial age zero" -&gt; "with an initial age of zero". Fourth paragraph: I suppose you would also want a strict lower bound of zero for the c parameter, otherwise M=1 always. </w:t>
+      </w:r>
+      <w:r>
+        <w:rPr>
+          <w:rFonts w:ascii="Lucida Grande" w:hAnsi="Lucida Grande" w:cs="Lucida Grande"/>
+          <w:color w:val="0070C0"/>
+          <w:sz w:val="21"/>
+          <w:szCs w:val="21"/>
+          <w:shd w:val="clear" w:color="auto" w:fill="FFFFFF"/>
+        </w:rPr>
+        <w:t xml:space="preserve">DONE and DONE  </w:t>
+      </w:r>
+      <w:r>
+        <w:rPr>
+          <w:rFonts w:ascii="Lucida Grande" w:hAnsi="Lucida Grande" w:cs="Lucida Grande"/>
+          <w:color w:val="EE0000"/>
+          <w:sz w:val="21"/>
+          <w:szCs w:val="21"/>
+          <w:shd w:val="clear" w:color="auto" w:fill="FFFFFF"/>
+        </w:rPr>
+        <w:t>Dogan check</w:t>
+      </w:r>
+      <w:r>
+        <w:rPr>
+          <w:rFonts w:ascii="Lucida Grande" w:hAnsi="Lucida Grande" w:cs="Lucida Grande"/>
+          <w:color w:val="00B050"/>
+          <w:sz w:val="21"/>
+          <w:szCs w:val="21"/>
+          <w:shd w:val="clear" w:color="auto" w:fill="FFFFFF"/>
+        </w:rPr>
+        <w:t xml:space="preserve"> Checked and confirmed correct.</w:t>
+      </w:r>
+      <w:r>
+        <w:rPr>
+          <w:rFonts w:ascii="Lucida Grande" w:hAnsi="Lucida Grande" w:cs="Lucida Grande"/>
+          <w:color w:val="000000"/>
+          <w:sz w:val="21"/>
+          <w:szCs w:val="21"/>
+        </w:rPr>
+        <w:br/>
+      </w:r>
+      <w:r>
+        <w:rPr>
+          <w:rFonts w:ascii="Lucida Grande" w:hAnsi="Lucida Grande" w:cs="Lucida Grande"/>
+          <w:color w:val="000000"/>
+          <w:sz w:val="21"/>
+          <w:szCs w:val="21"/>
+        </w:rPr>
+        <w:br/>
+      </w:r>
+      <w:r>
+        <w:rPr>
+          <w:rFonts w:ascii="Lucida Grande" w:hAnsi="Lucida Grande" w:cs="Lucida Grande"/>
+          <w:color w:val="000000"/>
+          <w:sz w:val="21"/>
+          <w:szCs w:val="21"/>
+          <w:shd w:val="clear" w:color="auto" w:fill="FFFFFF"/>
+        </w:rPr>
+        <w:t xml:space="preserve">Proof of Theorem 6, it's strange to have both M=0 and M=1 in the same sentence. Suggest stating that cH=0 so that M=max(0,1)=1. </w:t>
+      </w:r>
+      <w:r>
+        <w:rPr>
+          <w:rFonts w:ascii="Lucida Grande" w:hAnsi="Lucida Grande" w:cs="Lucida Grande"/>
+          <w:color w:val="EE0000"/>
+          <w:sz w:val="21"/>
+          <w:szCs w:val="21"/>
+          <w:shd w:val="clear" w:color="auto" w:fill="FFFFFF"/>
+        </w:rPr>
+        <w:t>Dogan?</w:t>
+      </w:r>
+      <w:r>
+        <w:rPr>
+          <w:rFonts w:ascii="Lucida Grande" w:hAnsi="Lucida Grande" w:cs="Lucida Grande"/>
+          <w:color w:val="00B050"/>
+          <w:sz w:val="21"/>
+          <w:szCs w:val="21"/>
+          <w:shd w:val="clear" w:color="auto" w:fill="FFFFFF"/>
+        </w:rPr>
+        <w:t xml:space="preserve"> Done. Changed to cH=0, so M=max(cH,1)=max(0,1)=1.</w:t>
+      </w:r>
+      <w:r>
+        <w:rPr>
+          <w:rFonts w:ascii="Lucida Grande" w:hAnsi="Lucida Grande" w:cs="Lucida Grande"/>
+          <w:color w:val="000000"/>
+          <w:sz w:val="21"/>
+          <w:szCs w:val="21"/>
+        </w:rPr>
+        <w:br/>
+      </w:r>
+      <w:r>
+        <w:rPr>
+          <w:rFonts w:ascii="Lucida Grande" w:hAnsi="Lucida Grande" w:cs="Lucida Grande"/>
+          <w:color w:val="000000"/>
+          <w:sz w:val="21"/>
+          <w:szCs w:val="21"/>
+        </w:rPr>
+        <w:br/>
+      </w:r>
+      <w:r>
+        <w:rPr>
+          <w:rFonts w:ascii="Lucida Grande" w:hAnsi="Lucida Grande" w:cs="Lucida Grande"/>
+          <w:color w:val="000000"/>
+          <w:sz w:val="21"/>
+          <w:szCs w:val="21"/>
+          <w:shd w:val="clear" w:color="auto" w:fill="FFFFFF"/>
+        </w:rPr>
+        <w:t xml:space="preserve">Proof of Theorem 8, something odd is happening with math spacing in the first line. </w:t>
+      </w:r>
+      <w:r>
+        <w:rPr>
+          <w:rFonts w:ascii="Lucida Grande" w:hAnsi="Lucida Grande" w:cs="Lucida Grande"/>
+          <w:color w:val="0070C0"/>
+          <w:sz w:val="21"/>
+          <w:szCs w:val="21"/>
+          <w:shd w:val="clear" w:color="auto" w:fill="FFFFFF"/>
+        </w:rPr>
+        <w:t>DONE</w:t>
+      </w:r>
+      <w:r>
+        <w:rPr>
+          <w:rFonts w:ascii="Lucida Grande" w:hAnsi="Lucida Grande" w:cs="Lucida Grande"/>
+          <w:color w:val="000000"/>
+          <w:sz w:val="21"/>
+          <w:szCs w:val="21"/>
+        </w:rPr>
+        <w:br/>
+      </w:r>
+      <w:r>
+        <w:rPr>
+          <w:rFonts w:ascii="Lucida Grande" w:hAnsi="Lucida Grande" w:cs="Lucida Grande"/>
+          <w:color w:val="000000"/>
+          <w:sz w:val="21"/>
+          <w:szCs w:val="21"/>
+        </w:rPr>
+        <w:br/>
+      </w:r>
+      <w:r>
+        <w:rPr>
+          <w:rFonts w:ascii="Lucida Grande" w:hAnsi="Lucida Grande" w:cs="Lucida Grande"/>
+          <w:color w:val="000000"/>
+          <w:sz w:val="21"/>
+          <w:szCs w:val="21"/>
+          <w:shd w:val="clear" w:color="auto" w:fill="FFFFFF"/>
+        </w:rPr>
+        <w:t xml:space="preserve">Lemma 4: I'm missing a factor of (1/2) somewhere (I get a leading constant of 3/128). </w:t>
+      </w:r>
+      <w:r>
+        <w:rPr>
+          <w:rFonts w:ascii="Lucida Grande" w:hAnsi="Lucida Grande" w:cs="Lucida Grande"/>
+          <w:color w:val="EE0000"/>
+          <w:sz w:val="21"/>
+          <w:szCs w:val="21"/>
+          <w:shd w:val="clear" w:color="auto" w:fill="FFFFFF"/>
+        </w:rPr>
+        <w:t>Dogan?</w:t>
+      </w:r>
+      <w:r>
+        <w:rPr>
+          <w:rFonts w:ascii="Lucida Grande" w:hAnsi="Lucida Grande" w:cs="Lucida Grande"/>
+          <w:color w:val="00B050"/>
+          <w:sz w:val="21"/>
+          <w:szCs w:val="21"/>
+          <w:shd w:val="clear" w:color="auto" w:fill="FFFFFF"/>
+        </w:rPr>
+        <w:t xml:space="preserve"> Done. Corrected 3/256 to 3/128. The extra 1/2 was unnecessary since we wait for the first death event.</w:t>
+      </w:r>
+      <w:r>
+        <w:rPr>
+          <w:rFonts w:ascii="Lucida Grande" w:hAnsi="Lucida Grande" w:cs="Lucida Grande"/>
+          <w:color w:val="000000"/>
+          <w:sz w:val="21"/>
+          <w:szCs w:val="21"/>
+        </w:rPr>
+        <w:br/>
+      </w:r>
+      <w:r>
+        <w:rPr>
+          <w:rFonts w:ascii="Lucida Grande" w:hAnsi="Lucida Grande" w:cs="Lucida Grande"/>
+          <w:color w:val="000000"/>
+          <w:sz w:val="21"/>
+          <w:szCs w:val="21"/>
+        </w:rPr>
+        <w:br/>
+      </w:r>
+      <w:r>
+        <w:rPr>
+          <w:rFonts w:ascii="Lucida Grande" w:hAnsi="Lucida Grande" w:cs="Lucida Grande"/>
+          <w:color w:val="000000"/>
+          <w:sz w:val="21"/>
+          <w:szCs w:val="21"/>
+          <w:shd w:val="clear" w:color="auto" w:fill="FFFFFF"/>
+        </w:rPr>
+        <w:t xml:space="preserve">Proof of Lemma 5: what do you mean by "Step 1"? I guess the displayed equation? Better to use a tag and eqref. </w:t>
+      </w:r>
+      <w:r>
+        <w:rPr>
+          <w:rFonts w:ascii="Lucida Grande" w:hAnsi="Lucida Grande" w:cs="Lucida Grande"/>
+          <w:color w:val="EE0000"/>
+          <w:sz w:val="21"/>
+          <w:szCs w:val="21"/>
+          <w:shd w:val="clear" w:color="auto" w:fill="FFFFFF"/>
+        </w:rPr>
+        <w:t>Dogan?</w:t>
+      </w:r>
+      <w:r>
+        <w:rPr>
+          <w:rFonts w:ascii="Lucida Grande" w:hAnsi="Lucida Grande" w:cs="Lucida Grande"/>
+          <w:color w:val="00B050"/>
+          <w:sz w:val="21"/>
+          <w:szCs w:val="21"/>
+          <w:shd w:val="clear" w:color="auto" w:fill="FFFFFF"/>
+        </w:rPr>
+        <w:t xml:space="preserve"> Done. Labelled the equation and replaced 'By Step 1' with eqref.</w:t>
+      </w:r>
+      <w:r>
+        <w:rPr>
+          <w:rFonts w:ascii="Lucida Grande" w:hAnsi="Lucida Grande" w:cs="Lucida Grande"/>
+          <w:color w:val="000000"/>
+          <w:sz w:val="21"/>
+          <w:szCs w:val="21"/>
+        </w:rPr>
+        <w:br/>
+      </w:r>
+      <w:r>
+        <w:rPr>
+          <w:rFonts w:ascii="Lucida Grande" w:hAnsi="Lucida Grande" w:cs="Lucida Grande"/>
+          <w:color w:val="000000"/>
+          <w:sz w:val="21"/>
+          <w:szCs w:val="21"/>
+        </w:rPr>
+        <w:br/>
+      </w:r>
+      <w:r>
+        <w:rPr>
+          <w:rFonts w:ascii="Lucida Grande" w:hAnsi="Lucida Grande" w:cs="Lucida Grande"/>
+          <w:color w:val="000000"/>
+          <w:sz w:val="21"/>
+          <w:szCs w:val="21"/>
+          <w:shd w:val="clear" w:color="auto" w:fill="FFFFFF"/>
+        </w:rPr>
+        <w:t xml:space="preserve">Page 14: I suggest explicitly defining \Delta_{fail} and \Delta^{succ}_z before they are used in the proofs of Lemmas 6 and 7. I guess also that \Delta^(i)_{fail} is the change in Hamming distance during the i-th failed attempt? </w:t>
+      </w:r>
+      <w:r>
+        <w:rPr>
+          <w:rFonts w:ascii="Lucida Grande" w:hAnsi="Lucida Grande" w:cs="Lucida Grande"/>
+          <w:color w:val="EE0000"/>
+          <w:sz w:val="21"/>
+          <w:szCs w:val="21"/>
+          <w:shd w:val="clear" w:color="auto" w:fill="FFFFFF"/>
+        </w:rPr>
+        <w:t>Dogan?</w:t>
+      </w:r>
+      <w:r>
+        <w:rPr>
+          <w:rFonts w:ascii="Lucida Grande" w:hAnsi="Lucida Grande" w:cs="Lucida Grande"/>
+          <w:color w:val="00B050"/>
+          <w:sz w:val="21"/>
+          <w:szCs w:val="21"/>
+          <w:shd w:val="clear" w:color="auto" w:fill="FFFFFF"/>
+        </w:rPr>
+        <w:t xml:space="preserve"> Done. Added explicit definitions for Delta_fail and Delta^succ_z before first use.</w:t>
+      </w:r>
+      <w:r>
+        <w:rPr>
+          <w:rFonts w:ascii="Lucida Grande" w:hAnsi="Lucida Grande" w:cs="Lucida Grande"/>
+          <w:color w:val="000000"/>
+          <w:sz w:val="21"/>
+          <w:szCs w:val="21"/>
+        </w:rPr>
+        <w:br/>
+      </w:r>
+      <w:r>
+        <w:rPr>
+          <w:rFonts w:ascii="Lucida Grande" w:hAnsi="Lucida Grande" w:cs="Lucida Grande"/>
+          <w:color w:val="000000"/>
+          <w:sz w:val="21"/>
+          <w:szCs w:val="21"/>
+        </w:rPr>
+        <w:br/>
+      </w:r>
+      <w:r>
+        <w:rPr>
+          <w:rFonts w:ascii="Lucida Grande" w:hAnsi="Lucida Grande" w:cs="Lucida Grande"/>
+          <w:color w:val="000000"/>
+          <w:sz w:val="21"/>
+          <w:szCs w:val="21"/>
+          <w:shd w:val="clear" w:color="auto" w:fill="FFFFFF"/>
+        </w:rPr>
+        <w:t>In several proofs (of Lemma 6, Lemma 8 and Theorem 11 for example), there is an inconsistent use of notation for expectation. Sometimes blackboard bold is used, sometimes not.</w:t>
+      </w:r>
+    </w:p>
+    <w:p>
+      <w:pPr>
+        <w:pStyle w:val="NormalWeb"/>
+        <w:rPr>
+          <w:rFonts w:ascii="Lucida Grande" w:hAnsi="Lucida Grande" w:cs="Lucida Grande"/>
+          <w:color w:val="0070C0"/>
+          <w:sz w:val="21"/>
+          <w:szCs w:val="21"/>
+          <w:shd w:val="clear" w:color="auto" w:fill="FFFFFF"/>
+        </w:rPr>
       </w:pPr>
       <w:r>
         <w:rPr>
@@ -3543,6 +4001,7 @@
           <w:szCs w:val="21"/>
           <w:shd w:val="clear" w:color="auto" w:fill="FFFFFF"/>
         </w:rPr>
+        <w:lastRenderedPageBreak/>
         <w:t xml:space="preserve">Fixed. </w:t>
       </w:r>
       <w:r>
@@ -3563,6 +4022,14 @@
           <w:szCs w:val="21"/>
         </w:rPr>
         <w:br/>
+      </w:r>
+      <w:r>
+        <w:rPr>
+          <w:rFonts w:ascii="Lucida Grande" w:hAnsi="Lucida Grande" w:cs="Lucida Grande"/>
+          <w:color w:val="000000"/>
+          <w:sz w:val="21"/>
+          <w:szCs w:val="21"/>
+        </w:rPr>
         <w:br/>
       </w:r>
       <w:r>
@@ -3593,7 +4060,17 @@
           <w:szCs w:val="21"/>
           <w:shd w:val="clear" w:color="auto" w:fill="FFFFFF"/>
         </w:rPr>
-        <w:t xml:space="preserve"> Done. Fixed \EE macro from \text{E} to \mathbb{E}, applying globally.</w:t>
+        <w:t xml:space="preserve"> Done. </w:t>
+      </w:r>
+      <w:r>
+        <w:rPr>
+          <w:rFonts w:ascii="Lucida Grande" w:hAnsi="Lucida Grande" w:cs="Lucida Grande"/>
+          <w:color w:val="A02B93" w:themeColor="accent5"/>
+          <w:sz w:val="21"/>
+          <w:szCs w:val="21"/>
+          <w:shd w:val="clear" w:color="auto" w:fill="FFFFFF"/>
+        </w:rPr>
+        <w:t>Fixed \EE macro from \text{E} to \mathbb{E},</w:t>
       </w:r>
       <w:r>
         <w:rPr>
@@ -3603,16 +4080,24 @@
           <w:szCs w:val="21"/>
           <w:shd w:val="clear" w:color="auto" w:fill="FFFFFF"/>
         </w:rPr>
-        <w:t xml:space="preserve"> Done. Added note that D(u) &gt;= 0 requires 1-2*rho &gt;= 0, i.e., d &lt;= n/4.</w:t>
-      </w:r>
-      <w:r>
-        <w:rPr>
-          <w:rFonts w:ascii="Lucida Grande" w:hAnsi="Lucida Grande" w:cs="Lucida Grande"/>
-          <w:color w:val="000000"/>
-          <w:sz w:val="21"/>
-          <w:szCs w:val="21"/>
-        </w:rPr>
-        <w:br/>
+        <w:t xml:space="preserve"> applying globally. Done. Added note that D(u) &gt;= 0 requires 1-2*rho &gt;= 0, i.e., d &lt;= n/4.</w:t>
+      </w:r>
+      <w:r>
+        <w:rPr>
+          <w:rFonts w:ascii="Lucida Grande" w:hAnsi="Lucida Grande" w:cs="Lucida Grande"/>
+          <w:color w:val="000000"/>
+          <w:sz w:val="21"/>
+          <w:szCs w:val="21"/>
+        </w:rPr>
+        <w:br/>
+      </w:r>
+      <w:r>
+        <w:rPr>
+          <w:rFonts w:ascii="Lucida Grande" w:hAnsi="Lucida Grande" w:cs="Lucida Grande"/>
+          <w:color w:val="000000"/>
+          <w:sz w:val="21"/>
+          <w:szCs w:val="21"/>
+        </w:rPr>
         <w:br/>
       </w:r>
       <w:r>
@@ -3653,6 +4138,14 @@
           <w:szCs w:val="21"/>
         </w:rPr>
         <w:br/>
+      </w:r>
+      <w:r>
+        <w:rPr>
+          <w:rFonts w:ascii="Lucida Grande" w:hAnsi="Lucida Grande" w:cs="Lucida Grande"/>
+          <w:color w:val="000000"/>
+          <w:sz w:val="21"/>
+          <w:szCs w:val="21"/>
+        </w:rPr>
         <w:br/>
       </w:r>
       <w:r>
@@ -3693,19 +4186,25 @@
           <w:szCs w:val="21"/>
         </w:rPr>
         <w:br/>
-        <w:br/>
-      </w:r>
-      <w:r>
-        <w:rPr>
-          <w:rFonts w:ascii="Lucida Grande" w:hAnsi="Lucida Grande" w:cs="Lucida Grande"/>
-          <w:color w:val="000000"/>
-          <w:sz w:val="21"/>
-          <w:szCs w:val="21"/>
-          <w:shd w:val="clear" w:color="auto" w:fill="FFFFFF"/>
-        </w:rPr>
-        <w:t xml:space="preserve">In the proof of Lemma 12, the sentence "If X \sim Bin(T,1/n)..." has a strange wording. It currently reads like the statement only holds if X is distributed this way, which I don't think you mean. Perhaps it would be better to write "Let X indicate the event that the </w:t>
-        <w:lastRenderedPageBreak/>
-        <w:t xml:space="preserve">leftmost bit is flipped, conditioned on the event that neither B_k nor D_p is sampled first..." or something similar. Also I am missing an argument that X is binomial distributed under that condition. At the end of the sentence, "if we condition on that" -&gt; "if we condition on THE EVENT that". </w:t>
+      </w:r>
+      <w:r>
+        <w:rPr>
+          <w:rFonts w:ascii="Lucida Grande" w:hAnsi="Lucida Grande" w:cs="Lucida Grande"/>
+          <w:color w:val="000000"/>
+          <w:sz w:val="21"/>
+          <w:szCs w:val="21"/>
+        </w:rPr>
+        <w:br/>
+      </w:r>
+      <w:r>
+        <w:rPr>
+          <w:rFonts w:ascii="Lucida Grande" w:hAnsi="Lucida Grande" w:cs="Lucida Grande"/>
+          <w:color w:val="000000"/>
+          <w:sz w:val="21"/>
+          <w:szCs w:val="21"/>
+          <w:shd w:val="clear" w:color="auto" w:fill="FFFFFF"/>
+        </w:rPr>
+        <w:t xml:space="preserve">In the proof of Lemma 12, the sentence "If X \sim Bin(T,1/n)..." has a strange wording. It currently reads like the statement only holds if X is distributed this way, which I don't think you mean. Perhaps it would be better to write "Let X indicate the event that the leftmost bit is flipped, conditioned on the event that neither B_k nor D_p is sampled first..." or something similar. Also I am missing an argument that X is binomial distributed under that condition. At the end of the sentence, "if we condition on that" -&gt; "if we condition on THE EVENT that". </w:t>
       </w:r>
       <w:r>
         <w:rPr>
@@ -3735,6 +4234,14 @@
           <w:szCs w:val="21"/>
         </w:rPr>
         <w:br/>
+      </w:r>
+      <w:r>
+        <w:rPr>
+          <w:rFonts w:ascii="Lucida Grande" w:hAnsi="Lucida Grande" w:cs="Lucida Grande"/>
+          <w:color w:val="000000"/>
+          <w:sz w:val="21"/>
+          <w:szCs w:val="21"/>
+        </w:rPr>
         <w:br/>
       </w:r>
       <w:r>
@@ -3775,6 +4282,14 @@
           <w:szCs w:val="21"/>
         </w:rPr>
         <w:br/>
+      </w:r>
+      <w:r>
+        <w:rPr>
+          <w:rFonts w:ascii="Lucida Grande" w:hAnsi="Lucida Grande" w:cs="Lucida Grande"/>
+          <w:color w:val="000000"/>
+          <w:sz w:val="21"/>
+          <w:szCs w:val="21"/>
+        </w:rPr>
         <w:br/>
       </w:r>
       <w:r>
@@ -3815,6 +4330,14 @@
           <w:szCs w:val="21"/>
         </w:rPr>
         <w:br/>
+      </w:r>
+      <w:r>
+        <w:rPr>
+          <w:rFonts w:ascii="Lucida Grande" w:hAnsi="Lucida Grande" w:cs="Lucida Grande"/>
+          <w:color w:val="000000"/>
+          <w:sz w:val="21"/>
+          <w:szCs w:val="21"/>
+        </w:rPr>
         <w:br/>
       </w:r>
       <w:r>
@@ -3845,6 +4368,14 @@
           <w:szCs w:val="21"/>
         </w:rPr>
         <w:br/>
+      </w:r>
+      <w:r>
+        <w:rPr>
+          <w:rFonts w:ascii="Lucida Grande" w:hAnsi="Lucida Grande" w:cs="Lucida Grande"/>
+          <w:color w:val="000000"/>
+          <w:sz w:val="21"/>
+          <w:szCs w:val="21"/>
+        </w:rPr>
         <w:br/>
       </w:r>
       <w:r>

</xml_diff>